<commit_message>
docs: Corrige a grafia do sobrenome Dunglas (autor do FrankenPHP) nas citações e referências do TCC
Co-Authored-By: Claude Sonnet 5.5 <noreply@anthropic.com>
</commit_message>
<xml_diff>
--- a/TRABALHO DE CONCLUSÃO DE CURSO (TCC)/Orientação – Desenvolvimento e Conclusão da Pesquisa/Desenvolvimento e Conclusão do TCC - André Pereira.docx
+++ b/TRABALHO DE CONCLUSÃO DE CURSO (TCC)/Orientação – Desenvolvimento e Conclusão da Pesquisa/Desenvolvimento e Conclusão do TCC - André Pereira.docx
@@ -3829,7 +3829,7 @@
           <w:sz w:val="24"/>
           <w:szCs w:val="24"/>
         </w:rPr>
-        <w:t xml:space="preserve">O FrankenPHP é um servidor de aplicação para PHP construído sobre o servidor Caddy, que incorpora o interpretador PHP ao próprio processo do servidor (DUNGALAS, 2024). Sem nenhuma configuração adicional, opera no </w:t>
+        <w:t xml:space="preserve">O FrankenPHP é um servidor de aplicação para PHP construído sobre o servidor Caddy, que incorpora o interpretador PHP ao próprio processo do servidor (DUNGLAS, 2024). Sem nenhuma configuração adicional, opera no </w:t>
       </w:r>
       <w:r>
         <w:rPr>
@@ -3881,7 +3881,7 @@
           <w:sz w:val="24"/>
           <w:szCs w:val="24"/>
         </w:rPr>
-        <w:t xml:space="preserve"> iniciadas na partida, comparável ao modo estático do PHP-FPM (DUNGALAS, 2024).</w:t>
+        <w:t xml:space="preserve"> iniciadas na partida, comparável ao modo estático do PHP-FPM (DUNGLAS, 2024).</w:t>
       </w:r>
     </w:p>
     <w:p>
@@ -3968,7 +3968,7 @@
           <w:sz w:val="24"/>
           <w:szCs w:val="24"/>
         </w:rPr>
-        <w:t xml:space="preserve">, e cada requisição executa apenas o tratamento do pedido (DUNGALAS, 2024). A contrapartida é que o programador passa a ser responsável por não vazar estado de uma requisição para outra, já que objetos e variáveis estáticas podem sobreviver entre elas.</w:t>
+        <w:t xml:space="preserve">, e cada requisição executa apenas o tratamento do pedido (DUNGLAS, 2024). A contrapartida é que o programador passa a ser responsável por não vazar estado de uma requisição para outra, já que objetos e variáveis estáticas podem sobreviver entre elas.</w:t>
       </w:r>
     </w:p>
     <w:p>
@@ -12632,7 +12632,7 @@
           <w:sz w:val="24"/>
           <w:szCs w:val="24"/>
         </w:rPr>
-        <w:t xml:space="preserve">Nos dois cenários a memória se manteve estável durante os 30 minutos, com variação de menos de 1 MiB entre o início e o fim do patamar, e a vazão e a latência ficaram no mesmo nível das execuções de 15 minutos (vazão 2,5% menor no C e 1,3% menor no D). Portanto, não houve evidência de acúmulo de memória nem de degradação de desempenho no modo Worker nem no CodeIgniter 4 nem no Laravel Octane, o que é relevante para a adoção do modo Worker em produção, em que o risco de vazamento entre requisições é a principal contrapartida (DUNGALAS, 2024). A estabilidade em 30 minutos, com 4 </w:t>
+        <w:t xml:space="preserve">Nos dois cenários a memória se manteve estável durante os 30 minutos, com variação de menos de 1 MiB entre o início e o fim do patamar, e a vazão e a latência ficaram no mesmo nível das execuções de 15 minutos (vazão 2,5% menor no C e 1,3% menor no D). Portanto, não houve evidência de acúmulo de memória nem de degradação de desempenho no modo Worker nem no CodeIgniter 4 nem no Laravel Octane, o que é relevante para a adoção do modo Worker em produção, em que o risco de vazamento entre requisições é a principal contrapartida (DUNGLAS, 2024). A estabilidade em 30 minutos, com 4 </w:t>
       </w:r>
       <w:r>
         <w:rPr>
@@ -13372,7 +13372,7 @@
           <w:sz w:val="24"/>
           <w:szCs w:val="24"/>
         </w:rPr>
-        <w:t xml:space="preserve"> se repete a cada requisição, e o modo Worker do FrankenPHP elimina essa repetição ao manter o processo vivo (DUNGALAS, 2024). O Quadro 1 mostra que, no CodeIgniter 4, o modo Worker preserva também a conexão com o banco e o estado da aplicação, de modo que o ganho decorre da soma da eliminação do </w:t>
+        <w:t xml:space="preserve"> se repete a cada requisição, e o modo Worker do FrankenPHP elimina essa repetição ao manter o processo vivo (DUNGLAS, 2024). O Quadro 1 mostra que, no CodeIgniter 4, o modo Worker preserva também a conexão com o banco e o estado da aplicação, de modo que o ganho decorre da soma da eliminação do </w:t>
       </w:r>
       <w:r>
         <w:rPr>
@@ -14368,7 +14368,7 @@
           <w:sz w:val="24"/>
           <w:szCs w:val="24"/>
         </w:rPr>
-        <w:t xml:space="preserve">DUNGALAS, Kévin. </w:t>
+        <w:t xml:space="preserve">DUNGLAS, Kévin. </w:t>
       </w:r>
       <w:r>
         <w:rPr>

</xml_diff>

<commit_message>
docs: Atualiza o TCC para as métricas do patamar, explicita o intervalo de cálculo e a vazão observada sob 100 usuários
Co-Authored-By: Claude Sonnet 5.5 <noreply@anthropic.com>
</commit_message>
<xml_diff>
--- a/TRABALHO DE CONCLUSÃO DE CURSO (TCC)/Orientação – Desenvolvimento e Conclusão da Pesquisa/Desenvolvimento e Conclusão do TCC - André Pereira.docx
+++ b/TRABALHO DE CONCLUSÃO DE CURSO (TCC)/Orientação – Desenvolvimento e Conclusão da Pesquisa/Desenvolvimento e Conclusão do TCC - André Pereira.docx
@@ -1191,7 +1191,7 @@
           <w:sz w:val="24"/>
           <w:szCs w:val="24"/>
         </w:rPr>
-        <w:t xml:space="preserve">Este trabalho analisa o impacto da execução persistente em memória no desempenho do framework CodeIgniter 4 (CI4). Compararam-se o PHP-FPM, o FrankenPHP em modo clássico e o FrankenPHP em modo Worker, com o Laravel Octane como referência de mercado, em contêineres Docker de mesma base (Debian 13) e com 1,0 CPU e 512 MB cada, sob carga gerada pelo k6 (100 usuários virtuais, 15 minutos) e monitoramento por Prometheus e Grafana. Em três execuções por cenário, a vazão média foi de 144 requisições por segundo (PHP-FPM), 156 (FrankenPHP clássico), 318 (CI4 em modo Worker) e 351 (Laravel Octane), sem erros. O modo Worker mais que dobrou a vazão do CI4 (+121%) e reduziu à metade as latências p95 e p99, ao custo de 46 MiB adicionais de memória, enquanto o modo clássico trouxe ganho modesto (+9%). Verificou-se que o CI4 em modo Worker preserva o estado da aplicação e a conexão com o banco, como o Octane, e que a memória permaneceu estável em testes de 30 minutos. Conclui-se que o modo Worker compensa em vazão e latência para o CI4, aproximando-o do Laravel Octane.</w:t>
+        <w:t xml:space="preserve">Este trabalho analisa o impacto da execução persistente em memória no desempenho do framework CodeIgniter 4 (CI4). Compararam-se o PHP-FPM, o FrankenPHP em modo clássico e o FrankenPHP em modo Worker, com o Laravel Octane como referência de mercado, em contêineres Docker de mesma base (Debian 13) e com 1,0 CPU e 512 MB cada, sob carga gerada pelo k6 (100 usuários virtuais, 15 minutos) e monitoramento por Prometheus e Grafana. Em três execuções por cenário, a vazão média foi de 143 requisições por segundo (PHP-FPM), 156 (FrankenPHP clássico), 304 (CI4 em modo Worker) e 337 (Laravel Octane), medidas no patamar de 10 minutos e sem erros. O modo Worker mais que dobrou a vazão do CI4 (+112%) e reduziu à metade as latências p95 e p99, ao custo de 46 MiB adicionais de memória, enquanto o modo clássico trouxe ganho modesto (+9%). Verificou-se que o CI4 em modo Worker preserva o estado da aplicação e a conexão com o banco, como o Octane, e que a memória permaneceu estável em testes de 30 minutos. Conclui-se que o modo Worker compensa em vazão e latência para o CI4, aproximando-o do Laravel Octane.</w:t>
       </w:r>
     </w:p>
     <w:p>
@@ -1251,7 +1251,7 @@
           <w:sz w:val="24"/>
           <w:szCs w:val="24"/>
         </w:rPr>
-        <w:t xml:space="preserve">This work analyzes the impact of persistent in-memory execution on the performance of the CodeIgniter 4 (CI4) framework. PHP-FPM, FrankenPHP in classic mode and FrankenPHP in Worker mode were compared, with Laravel Octane as a market reference, in Docker containers sharing the same base image (Debian 13) and limited to 1.0 CPU and 512 MB each, under load generated by k6 (100 virtual users, 15 minutes) and monitored with Prometheus and Grafana. Over three runs per scenario, mean throughput was 144 requests per second (PHP-FPM), 156 (classic FrankenPHP), 318 (CI4 in Worker mode) and 351 (Laravel Octane), with no errors. Worker mode more than doubled CI4 throughput (+121%) and halved p95 and p99 latency, at the cost of 46 MiB of additional memory, whereas classic mode brought a modest gain (+9%). CI4 in Worker mode was found to preserve application state and the database connection, like Octane, and memory remained stable in 30-minute tests. It is concluded that Worker mode pays off in throughput and latency for CI4, bringing it close to Laravel Octane.</w:t>
+        <w:t xml:space="preserve">This work analyzes the impact of persistent in-memory execution on the performance of the CodeIgniter 4 (CI4) framework. PHP-FPM, FrankenPHP in classic mode and FrankenPHP in Worker mode were compared, with Laravel Octane as a market reference, in Docker containers sharing the same base image (Debian 13) and limited to 1.0 CPU and 512 MB each, under load generated by k6 (100 virtual users, 15 minutes) and monitored with Prometheus and Grafana. Over three runs per scenario, mean throughput at the 10-minute plateau was 143 requests per second (PHP-FPM), 156 (classic FrankenPHP), 304 (CI4 in Worker mode) and 337 (Laravel Octane), with no errors. Worker mode more than doubled CI4 throughput (+112%) and halved p95 and p99 latency, at the cost of 46 MiB of additional memory, whereas classic mode brought a modest gain (+9%). CI4 in Worker mode was found to preserve application state and the database connection, like Octane, and memory remained stable in 30-minute tests. It is concluded that Worker mode pays off in throughput and latency for CI4, bringing it close to Laravel Octane.</w:t>
       </w:r>
     </w:p>
     <w:p>
@@ -1774,7 +1774,7 @@
           <w:sz w:val="24"/>
           <w:szCs w:val="24"/>
         </w:rPr>
-        <w:t xml:space="preserve">	22</w:t>
+        <w:t xml:space="preserve">	23</w:t>
       </w:r>
     </w:p>
     <w:p>
@@ -1858,7 +1858,7 @@
           <w:sz w:val="24"/>
           <w:szCs w:val="24"/>
         </w:rPr>
-        <w:t xml:space="preserve">	65</w:t>
+        <w:t xml:space="preserve">	67</w:t>
       </w:r>
     </w:p>
     <w:p>
@@ -1886,7 +1886,7 @@
           <w:sz w:val="24"/>
           <w:szCs w:val="24"/>
         </w:rPr>
-        <w:t xml:space="preserve">	65</w:t>
+        <w:t xml:space="preserve">	67</w:t>
       </w:r>
     </w:p>
     <w:p>
@@ -2972,7 +2972,7 @@
           <w:sz w:val="24"/>
           <w:szCs w:val="24"/>
         </w:rPr>
-        <w:t xml:space="preserve">	36</w:t>
+        <w:t xml:space="preserve">	37</w:t>
       </w:r>
     </w:p>
     <w:p>
@@ -3000,7 +3000,7 @@
           <w:sz w:val="24"/>
           <w:szCs w:val="24"/>
         </w:rPr>
-        <w:t xml:space="preserve">	38</w:t>
+        <w:t xml:space="preserve">	40</w:t>
       </w:r>
     </w:p>
     <w:p>
@@ -3028,7 +3028,7 @@
           <w:sz w:val="24"/>
           <w:szCs w:val="24"/>
         </w:rPr>
-        <w:t xml:space="preserve">	39</w:t>
+        <w:t xml:space="preserve">	41</w:t>
       </w:r>
     </w:p>
     <w:p>
@@ -3056,7 +3056,7 @@
           <w:sz w:val="24"/>
           <w:szCs w:val="24"/>
         </w:rPr>
-        <w:t xml:space="preserve">	44</w:t>
+        <w:t xml:space="preserve">	46</w:t>
       </w:r>
     </w:p>
     <w:p>
@@ -3084,7 +3084,7 @@
           <w:sz w:val="24"/>
           <w:szCs w:val="24"/>
         </w:rPr>
-        <w:t xml:space="preserve">	49</w:t>
+        <w:t xml:space="preserve">	51</w:t>
       </w:r>
     </w:p>
     <w:p>
@@ -3112,7 +3112,7 @@
           <w:sz w:val="24"/>
           <w:szCs w:val="24"/>
         </w:rPr>
-        <w:t xml:space="preserve">	53</w:t>
+        <w:t xml:space="preserve">	55</w:t>
       </w:r>
     </w:p>
     <w:p>
@@ -3140,7 +3140,7 @@
           <w:sz w:val="24"/>
           <w:szCs w:val="24"/>
         </w:rPr>
-        <w:t xml:space="preserve">	62</w:t>
+        <w:t xml:space="preserve">	64</w:t>
       </w:r>
     </w:p>
     <w:p>
@@ -3168,7 +3168,7 @@
           <w:sz w:val="24"/>
           <w:szCs w:val="24"/>
         </w:rPr>
-        <w:t xml:space="preserve">	65</w:t>
+        <w:t xml:space="preserve">	67</w:t>
       </w:r>
     </w:p>
     <w:p>
@@ -3202,7 +3202,7 @@
           <w:sz w:val="24"/>
           <w:szCs w:val="24"/>
         </w:rPr>
-        <w:t xml:space="preserve">	66</w:t>
+        <w:t xml:space="preserve">	68</w:t>
       </w:r>
     </w:p>
     <w:p>
@@ -4975,7 +4975,7 @@
           <w:sz w:val="24"/>
           <w:szCs w:val="24"/>
         </w:rPr>
-        <w:t xml:space="preserve"> a cada poucos segundos, em paralelo ao teste.</w:t>
+        <w:t xml:space="preserve"> a cada poucos segundos, em paralelo ao teste. A vazão e a latência são calculadas apenas sobre o patamar de 10 minutos (aquecimento, rampa e descida excluídos), e a vazão é o número de requisições do patamar dividido por 600 s; a CPU e a RAM são médias da mesma janela. Como a carga usa um único nível de concorrência (100 usuários virtuais), a vazão medida é a observada nessa carga, e não necessariamente a capacidade máxima de cada cenário.</w:t>
       </w:r>
     </w:p>
     <w:p>
@@ -5214,7 +5214,7 @@
           <w:sz w:val="24"/>
           <w:szCs w:val="24"/>
         </w:rPr>
-        <w:t xml:space="preserve">Para cada cenário foram calculadas a média e o desvio-padrão, entre as três execuções, da vazão (RPS), da latência (p50, p95 e p99), da taxa de erros e do consumo de CPU e RAM no patamar sustentado. Os ganhos foram expressos em variação percentual. Como as execuções de um mesmo cenário foram apenas três, aplicou-se, em complemento, a análise de variância de um fator (ANOVA) e testes t de Welch par a par, com correção de Bonferroni, em linha com o procedimento adotado por Luz, Silva e Emer (2024); com n = 3 o poder desses testes é limitado, e eles servem como reforço, e não como único critério. A interpretação da latência considera a Lei de Little para sistemas fechados (LITTLE, 1961). O processamento é feito pelo </w:t>
+        <w:t xml:space="preserve">Para cada cenário foram calculadas a média e o desvio-padrão, entre as três execuções, da vazão (RPS), da latência (p50, p95 e p99), da taxa de erros e do consumo de CPU e RAM, todos calculados no patamar sustentado de 10 minutos. Os ganhos foram expressos em variação percentual. Como as execuções de um mesmo cenário foram apenas três, aplicou-se, em complemento, a análise de variância de um fator (ANOVA) e testes t de Welch par a par, com correção de Bonferroni, em linha com o procedimento adotado por Luz, Silva e Emer (2024); com n = 3 o poder desses testes é limitado, e eles servem como reforço, e não como único critério. A interpretação da latência considera a Lei de Little para sistemas fechados (LITTLE, 1961). O processamento é feito pelo </w:t>
       </w:r>
       <w:r>
         <w:rPr>
@@ -5283,7 +5283,7 @@
           <w:sz w:val="24"/>
           <w:szCs w:val="24"/>
         </w:rPr>
-        <w:t xml:space="preserve">Este capítulo apresenta os resultados obtidos nos cenários descritos na Metodologia e os interpreta à luz do referencial teórico. Os valores oficiais provêm de 15 execuções do teste de carga de 15 minutos (3 repetições de cada um dos cenários A, B, C, D e E) e de dois testes longos de 30 minutos de patamar (cenários C e D). As figuras extraídas do Grafana e do painel do k6 (Figuras 5 a 12) vêm de uma execução adicional de cada cenário, feita apenas para captura, e não entram nas médias.</w:t>
+        <w:t xml:space="preserve">Este capítulo apresenta os resultados obtidos nos cenários descritos na Metodologia e os interpreta à luz do referencial teórico. Os valores oficiais de vazão e latência são do patamar de 10 minutos de cada execução (aquecimento, rampa e descida excluídos) e provêm de 15 execuções do teste de carga de 15 minutos (3 repetições de cada um dos cenários A, B, C, D e E) e de dois testes longos de 30 minutos de patamar (cenários C e D). As figuras extraídas do Grafana e do painel do k6 (Figuras 5 a 12) vêm de uma execução adicional de cada cenário, feita apenas para captura, e não entram nas médias.</w:t>
       </w:r>
     </w:p>
     <w:p>
@@ -6291,7 +6291,7 @@
           <w:sz w:val="24"/>
           <w:szCs w:val="24"/>
         </w:rPr>
-        <w:t xml:space="preserve">A Tabela 1 e a Figura 1 apresentam a vazão média e o desvio-padrão das três execuções de cada cenário, sob 100 usuários virtuais simultâneos, em um orçamento de 1,0 CPU e 512 MB por cenário, e a latência global das requisições.</w:t>
+        <w:t xml:space="preserve">A Tabela 1 e a Figura 1 apresentam a vazão média e o desvio-padrão das três execuções de cada cenário, medidas no patamar de 10 minutos sob 100 usuários virtuais simultâneos (a vazão observada nessa carga, não necessariamente a capacidade máxima de cada cenário), em um orçamento de 1,0 CPU e 512 MB por cenário, e a latência global das requisições.</w:t>
       </w:r>
     </w:p>
     <w:p>
@@ -6600,7 +6600,7 @@
                 <w:sz w:val="20"/>
                 <w:szCs w:val="20"/>
               </w:rPr>
-              <w:t xml:space="preserve">143,7 ± 0,5</w:t>
+              <w:t xml:space="preserve">143,2 ± 0,6</w:t>
             </w:r>
           </w:p>
         </w:tc>
@@ -6633,7 +6633,7 @@
                 <w:sz w:val="20"/>
                 <w:szCs w:val="20"/>
               </w:rPr>
-              <w:t xml:space="preserve">687,4</w:t>
+              <w:t xml:space="preserve">698,2</w:t>
             </w:r>
           </w:p>
         </w:tc>
@@ -6666,7 +6666,7 @@
                 <w:sz w:val="20"/>
                 <w:szCs w:val="20"/>
               </w:rPr>
-              <w:t xml:space="preserve">785,6</w:t>
+              <w:t xml:space="preserve">789,7</w:t>
             </w:r>
           </w:p>
         </w:tc>
@@ -6699,7 +6699,7 @@
                 <w:sz w:val="20"/>
                 <w:szCs w:val="20"/>
               </w:rPr>
-              <w:t xml:space="preserve">800,5</w:t>
+              <w:t xml:space="preserve">807,2</w:t>
             </w:r>
           </w:p>
         </w:tc>
@@ -6804,7 +6804,7 @@
                 <w:sz w:val="20"/>
                 <w:szCs w:val="20"/>
               </w:rPr>
-              <w:t xml:space="preserve">156,1 ± 1,4</w:t>
+              <w:t xml:space="preserve">155,8 ± 1,6</w:t>
             </w:r>
           </w:p>
         </w:tc>
@@ -6837,7 +6837,7 @@
                 <w:sz w:val="20"/>
                 <w:szCs w:val="20"/>
               </w:rPr>
-              <w:t xml:space="preserve">602,7</w:t>
+              <w:t xml:space="preserve">618,0</w:t>
             </w:r>
           </w:p>
         </w:tc>
@@ -6870,7 +6870,7 @@
                 <w:sz w:val="20"/>
                 <w:szCs w:val="20"/>
               </w:rPr>
-              <w:t xml:space="preserve">710,0</w:t>
+              <w:t xml:space="preserve">743,2</w:t>
             </w:r>
           </w:p>
         </w:tc>
@@ -6903,7 +6903,7 @@
                 <w:sz w:val="20"/>
                 <w:szCs w:val="20"/>
               </w:rPr>
-              <w:t xml:space="preserve">782,9</w:t>
+              <w:t xml:space="preserve">793,2</w:t>
             </w:r>
           </w:p>
         </w:tc>
@@ -7030,7 +7030,7 @@
                 <w:sz w:val="20"/>
                 <w:szCs w:val="20"/>
               </w:rPr>
-              <w:t xml:space="preserve">175,5 ± 1,7</w:t>
+              <w:t xml:space="preserve">176,4 ± 1,8</w:t>
             </w:r>
           </w:p>
         </w:tc>
@@ -7063,7 +7063,7 @@
                 <w:sz w:val="20"/>
                 <w:szCs w:val="20"/>
               </w:rPr>
-              <w:t xml:space="preserve">524,6</w:t>
+              <w:t xml:space="preserve">563,3</w:t>
             </w:r>
           </w:p>
         </w:tc>
@@ -7096,7 +7096,7 @@
                 <w:sz w:val="20"/>
                 <w:szCs w:val="20"/>
               </w:rPr>
-              <w:t xml:space="preserve">660,6</w:t>
+              <w:t xml:space="preserve">676,1</w:t>
             </w:r>
           </w:p>
         </w:tc>
@@ -7129,7 +7129,7 @@
                 <w:sz w:val="20"/>
                 <w:szCs w:val="20"/>
               </w:rPr>
-              <w:t xml:space="preserve">720,7</w:t>
+              <w:t xml:space="preserve">734,3</w:t>
             </w:r>
           </w:p>
         </w:tc>
@@ -7234,7 +7234,7 @@
                 <w:sz w:val="20"/>
                 <w:szCs w:val="20"/>
               </w:rPr>
-              <w:t xml:space="preserve">318,1 ± 6,1</w:t>
+              <w:t xml:space="preserve">303,9 ± 2,1</w:t>
             </w:r>
           </w:p>
         </w:tc>
@@ -7267,7 +7267,7 @@
                 <w:sz w:val="20"/>
                 <w:szCs w:val="20"/>
               </w:rPr>
-              <w:t xml:space="preserve">300,2</w:t>
+              <w:t xml:space="preserve">309,8</w:t>
             </w:r>
           </w:p>
         </w:tc>
@@ -7300,7 +7300,7 @@
                 <w:sz w:val="20"/>
                 <w:szCs w:val="20"/>
               </w:rPr>
-              <w:t xml:space="preserve">394,1</w:t>
+              <w:t xml:space="preserve">397,9</w:t>
             </w:r>
           </w:p>
         </w:tc>
@@ -7333,7 +7333,7 @@
                 <w:sz w:val="20"/>
                 <w:szCs w:val="20"/>
               </w:rPr>
-              <w:t xml:space="preserve">405,7</w:t>
+              <w:t xml:space="preserve">408,3</w:t>
             </w:r>
           </w:p>
         </w:tc>
@@ -7438,7 +7438,7 @@
                 <w:sz w:val="20"/>
                 <w:szCs w:val="20"/>
               </w:rPr>
-              <w:t xml:space="preserve">351,3 ± 0,9</w:t>
+              <w:t xml:space="preserve">336,9 ± 1,0</w:t>
             </w:r>
           </w:p>
         </w:tc>
@@ -7471,7 +7471,7 @@
                 <w:sz w:val="20"/>
                 <w:szCs w:val="20"/>
               </w:rPr>
-              <w:t xml:space="preserve">287,6</w:t>
+              <w:t xml:space="preserve">298,2</w:t>
             </w:r>
           </w:p>
         </w:tc>
@@ -7504,7 +7504,7 @@
                 <w:sz w:val="20"/>
                 <w:szCs w:val="20"/>
               </w:rPr>
-              <w:t xml:space="preserve">374,6</w:t>
+              <w:t xml:space="preserve">383,6</w:t>
             </w:r>
           </w:p>
         </w:tc>
@@ -7537,7 +7537,7 @@
                 <w:sz w:val="20"/>
                 <w:szCs w:val="20"/>
               </w:rPr>
-              <w:t xml:space="preserve">396,8</w:t>
+              <w:t xml:space="preserve">399,7</w:t>
             </w:r>
           </w:p>
         </w:tc>
@@ -7587,7 +7587,7 @@
           <w:sz w:val="20"/>
           <w:szCs w:val="20"/>
         </w:rPr>
-        <w:t xml:space="preserve">Fonte: elaborado pelo autor (2026), a partir dos resumos do k6. Nota: percentis calculados sobre toda a execução, incluindo as rampas.</w:t>
+        <w:t xml:space="preserve">Fonte: elaborado pelo autor (2026), a partir dos resumos do k6. Nota: RPS (requisições do patamar divididas por 600 s) e percentis calculados no patamar de 10 minutos, sem aquecimento, rampa e descida.</w:t>
       </w:r>
     </w:p>
     <w:p>
@@ -7678,7 +7678,7 @@
           <w:sz w:val="24"/>
           <w:szCs w:val="24"/>
         </w:rPr>
-        <w:t xml:space="preserve">Em relação ao cenário A, o modo clássico do FrankenPHP (B) apresentou vazão 8,7% maior, o Worker com CodeIgniter 4 (C) apresentou vazão 121,4% maior (cerca de 2,2 vezes) e o Laravel Octane (D) apresentou vazão 144,5% maior (cerca de 2,4 vezes). Entre C e B, a diferença é de 103,7% a favor de C. A latência acompanha a vazão: o p95 do cenário C é 49,8% menor que o do A (394,1 contra 785,6 ms) e o p99, 49,3% menor (405,7 contra 800,5 ms). O desvio-padrão entre execuções do mesmo cenário ficou entre 0,3% e 1,9% da média, muito menor que as diferenças entre cenários, exceto entre C e D, discutida adiante.</w:t>
+        <w:t xml:space="preserve">Em relação ao cenário A, o modo clássico do FrankenPHP (B) apresentou vazão 8,8% maior, o Worker com CodeIgniter 4 (C) apresentou vazão 112,2% maior (cerca de 2,1 vezes) e o Laravel Octane (D) apresentou vazão 135,2% maior (cerca de 2,4 vezes). Entre C e B, que usam o mesmo servidor e o mesmo número de unidades de concorrência, a diferença é de 95,0% a favor de C. A latência acompanha a vazão: o p95 do cenário C é 49,6% menor que o do A (397,9 contra 789,7 ms) e o p99, 49,4% menor (408,3 contra 807,2 ms). O desvio-padrão entre execuções do mesmo cenário ficou entre 0,3% e 1,0% da média, muito menor que as diferenças entre cenários.</w:t>
       </w:r>
     </w:p>
     <w:p>
@@ -7693,7 +7693,7 @@
           <w:sz w:val="24"/>
           <w:szCs w:val="24"/>
         </w:rPr>
-        <w:t xml:space="preserve">A Tabela 2 reúne os testes estatísticos. A análise de variância (ANOVA) indicou diferença entre os cinco cenários na vazão (F = 3.311,6; p &lt; 0,001), no p95 (F = 2.179,3; p &lt; 0,001) e no p99 (F = 1.107,4; p &lt; 0,001). Nos testes t de Welch par a par, com correção de Bonferroni para as seis comparações, as diferenças de vazão entre A, B, E e C permaneceram significativas ao nível de 5%; a diferença de vazão entre D e C teve p = 0,0098 sem correção e p ajustado = 0,059, ou seja, não é significativa após a correção. Como há apenas três execuções por cenário, o poder dos testes é limitado, e a diferença de 10,4% entre D e C deve ser lida como indicativa. O mesmo vale para o p99, em que B não difere de A (p ajustado = 0,97) e E difere de B apenas sem correção.</w:t>
+        <w:t xml:space="preserve">A Tabela 2 reúne os testes estatísticos. A análise de variância (ANOVA) indicou diferença entre os cinco cenários na vazão (F = 10.524,5; p &lt; 0,001), no p95 (F = 550,7; p &lt; 0,001) e no p99 (F = 855,2; p &lt; 0,001). Nos testes t de Welch par a par, com correção de Bonferroni para as seis comparações, todas as diferenças de vazão permaneceram significativas ao nível de 5%, inclusive a de D sobre C (+10,9%; p ajustado = 0,001). No p95, as diferenças de B sobre A (p ajustado = 0,65) e de E sobre B (0,24) não foram significativas, e no p99 tampouco (B sobre A, p ajustado = 0,76; E sobre B, 0,23). Com apenas três execuções por cenário, o poder dos testes é limitado e a normalidade não pode ser verificada; por isso os valores de p devem ser lidos como reforço à diferença de ordem de grandeza entre os cenários, e não como critério isolado.</w:t>
       </w:r>
     </w:p>
     <w:p>
@@ -8036,7 +8036,7 @@
                 <w:sz w:val="20"/>
                 <w:szCs w:val="20"/>
               </w:rPr>
-              <w:t xml:space="preserve">+8,7</w:t>
+              <w:t xml:space="preserve">+8,8</w:t>
             </w:r>
           </w:p>
         </w:tc>
@@ -8069,7 +8069,7 @@
                 <w:sz w:val="20"/>
                 <w:szCs w:val="20"/>
               </w:rPr>
-              <w:t xml:space="preserve">0,012</w:t>
+              <w:t xml:space="preserve">0,013</w:t>
             </w:r>
           </w:p>
         </w:tc>
@@ -8102,7 +8102,7 @@
                 <w:sz w:val="20"/>
                 <w:szCs w:val="20"/>
               </w:rPr>
-              <w:t xml:space="preserve">−9,6</w:t>
+              <w:t xml:space="preserve">−5,9</w:t>
             </w:r>
           </w:p>
         </w:tc>
@@ -8135,7 +8135,7 @@
                 <w:sz w:val="20"/>
                 <w:szCs w:val="20"/>
               </w:rPr>
-              <w:t xml:space="preserve">0,003</w:t>
+              <w:t xml:space="preserve">0,65</w:t>
             </w:r>
           </w:p>
         </w:tc>
@@ -8168,7 +8168,7 @@
                 <w:sz w:val="20"/>
                 <w:szCs w:val="20"/>
               </w:rPr>
-              <w:t xml:space="preserve">−2,2</w:t>
+              <w:t xml:space="preserve">−1,7</w:t>
             </w:r>
           </w:p>
         </w:tc>
@@ -8201,7 +8201,7 @@
                 <w:sz w:val="20"/>
                 <w:szCs w:val="20"/>
               </w:rPr>
-              <w:t xml:space="preserve">0,97</w:t>
+              <w:t xml:space="preserve">0,76</w:t>
             </w:r>
           </w:p>
         </w:tc>
@@ -8273,7 +8273,7 @@
                 <w:sz w:val="20"/>
                 <w:szCs w:val="20"/>
               </w:rPr>
-              <w:t xml:space="preserve">+12,4</w:t>
+              <w:t xml:space="preserve">+13,2</w:t>
             </w:r>
           </w:p>
         </w:tc>
@@ -8339,7 +8339,7 @@
                 <w:sz w:val="20"/>
                 <w:szCs w:val="20"/>
               </w:rPr>
-              <w:t xml:space="preserve">−7,0</w:t>
+              <w:t xml:space="preserve">−9,0</w:t>
             </w:r>
           </w:p>
         </w:tc>
@@ -8372,7 +8372,7 @@
                 <w:sz w:val="20"/>
                 <w:szCs w:val="20"/>
               </w:rPr>
-              <w:t xml:space="preserve">0,099</w:t>
+              <w:t xml:space="preserve">0,24</w:t>
             </w:r>
           </w:p>
         </w:tc>
@@ -8405,7 +8405,7 @@
                 <w:sz w:val="20"/>
                 <w:szCs w:val="20"/>
               </w:rPr>
-              <w:t xml:space="preserve">−7,9</w:t>
+              <w:t xml:space="preserve">−7,4</w:t>
             </w:r>
           </w:p>
         </w:tc>
@@ -8438,7 +8438,7 @@
                 <w:sz w:val="20"/>
                 <w:szCs w:val="20"/>
               </w:rPr>
-              <w:t xml:space="preserve">0,070</w:t>
+              <w:t xml:space="preserve">0,23</w:t>
             </w:r>
           </w:p>
         </w:tc>
@@ -8510,73 +8510,7 @@
                 <w:sz w:val="20"/>
                 <w:szCs w:val="20"/>
               </w:rPr>
-              <w:t xml:space="preserve">+121,4</w:t>
-            </w:r>
-          </w:p>
-        </w:tc>
-        <w:tc>
-          <w:tcPr>
-            <w:tcW w:type="dxa" w:w="1045"/>
-            <w:tcBorders>
-              <w:top w:val="none" w:color="FFFFFF" w:sz="0"/>
-              <w:left w:val="none" w:color="FFFFFF" w:sz="0"/>
-              <w:bottom w:val="none" w:color="FFFFFF" w:sz="0"/>
-              <w:right w:val="none" w:color="FFFFFF" w:sz="0"/>
-            </w:tcBorders>
-            <w:tcMar>
-              <w:top w:type="dxa" w:w="40"/>
-              <w:left w:type="dxa" w:w="80"/>
-              <w:bottom w:type="dxa" w:w="40"/>
-              <w:right w:type="dxa" w:w="80"/>
-            </w:tcMar>
-          </w:tcPr>
-          <w:p>
-            <w:pPr>
-              <w:spacing w:line="240"/>
-              <w:jc w:val="center"/>
-            </w:pPr>
-            <w:r>
-              <w:rPr>
-                <w:rFonts w:ascii="Times New Roman" w:cs="Times New Roman" w:eastAsia="Times New Roman" w:hAnsi="Times New Roman"/>
-                <w:b w:val="false"/>
-                <w:bCs w:val="false"/>
-                <w:sz w:val="20"/>
-                <w:szCs w:val="20"/>
-              </w:rPr>
-              <w:t xml:space="preserve">0,002</w:t>
-            </w:r>
-          </w:p>
-        </w:tc>
-        <w:tc>
-          <w:tcPr>
-            <w:tcW w:type="dxa" w:w="1045"/>
-            <w:tcBorders>
-              <w:top w:val="none" w:color="FFFFFF" w:sz="0"/>
-              <w:left w:val="none" w:color="FFFFFF" w:sz="0"/>
-              <w:bottom w:val="none" w:color="FFFFFF" w:sz="0"/>
-              <w:right w:val="none" w:color="FFFFFF" w:sz="0"/>
-            </w:tcBorders>
-            <w:tcMar>
-              <w:top w:type="dxa" w:w="40"/>
-              <w:left w:type="dxa" w:w="80"/>
-              <w:bottom w:type="dxa" w:w="40"/>
-              <w:right w:type="dxa" w:w="80"/>
-            </w:tcMar>
-          </w:tcPr>
-          <w:p>
-            <w:pPr>
-              <w:spacing w:line="240"/>
-              <w:jc w:val="center"/>
-            </w:pPr>
-            <w:r>
-              <w:rPr>
-                <w:rFonts w:ascii="Times New Roman" w:cs="Times New Roman" w:eastAsia="Times New Roman" w:hAnsi="Times New Roman"/>
-                <w:b w:val="false"/>
-                <w:bCs w:val="false"/>
-                <w:sz w:val="20"/>
-                <w:szCs w:val="20"/>
-              </w:rPr>
-              <w:t xml:space="preserve">−49,8</w:t>
+              <w:t xml:space="preserve">+112,2</w:t>
             </w:r>
           </w:p>
         </w:tc>
@@ -8642,7 +8576,73 @@
                 <w:sz w:val="20"/>
                 <w:szCs w:val="20"/>
               </w:rPr>
-              <w:t xml:space="preserve">−49,3</w:t>
+              <w:t xml:space="preserve">−49,6</w:t>
+            </w:r>
+          </w:p>
+        </w:tc>
+        <w:tc>
+          <w:tcPr>
+            <w:tcW w:type="dxa" w:w="1045"/>
+            <w:tcBorders>
+              <w:top w:val="none" w:color="FFFFFF" w:sz="0"/>
+              <w:left w:val="none" w:color="FFFFFF" w:sz="0"/>
+              <w:bottom w:val="none" w:color="FFFFFF" w:sz="0"/>
+              <w:right w:val="none" w:color="FFFFFF" w:sz="0"/>
+            </w:tcBorders>
+            <w:tcMar>
+              <w:top w:type="dxa" w:w="40"/>
+              <w:left w:type="dxa" w:w="80"/>
+              <w:bottom w:type="dxa" w:w="40"/>
+              <w:right w:type="dxa" w:w="80"/>
+            </w:tcMar>
+          </w:tcPr>
+          <w:p>
+            <w:pPr>
+              <w:spacing w:line="240"/>
+              <w:jc w:val="center"/>
+            </w:pPr>
+            <w:r>
+              <w:rPr>
+                <w:rFonts w:ascii="Times New Roman" w:cs="Times New Roman" w:eastAsia="Times New Roman" w:hAnsi="Times New Roman"/>
+                <w:b w:val="false"/>
+                <w:bCs w:val="false"/>
+                <w:sz w:val="20"/>
+                <w:szCs w:val="20"/>
+              </w:rPr>
+              <w:t xml:space="preserve">&lt; 0,001</w:t>
+            </w:r>
+          </w:p>
+        </w:tc>
+        <w:tc>
+          <w:tcPr>
+            <w:tcW w:type="dxa" w:w="1045"/>
+            <w:tcBorders>
+              <w:top w:val="none" w:color="FFFFFF" w:sz="0"/>
+              <w:left w:val="none" w:color="FFFFFF" w:sz="0"/>
+              <w:bottom w:val="none" w:color="FFFFFF" w:sz="0"/>
+              <w:right w:val="none" w:color="FFFFFF" w:sz="0"/>
+            </w:tcBorders>
+            <w:tcMar>
+              <w:top w:type="dxa" w:w="40"/>
+              <w:left w:type="dxa" w:w="80"/>
+              <w:bottom w:type="dxa" w:w="40"/>
+              <w:right w:type="dxa" w:w="80"/>
+            </w:tcMar>
+          </w:tcPr>
+          <w:p>
+            <w:pPr>
+              <w:spacing w:line="240"/>
+              <w:jc w:val="center"/>
+            </w:pPr>
+            <w:r>
+              <w:rPr>
+                <w:rFonts w:ascii="Times New Roman" w:cs="Times New Roman" w:eastAsia="Times New Roman" w:hAnsi="Times New Roman"/>
+                <w:b w:val="false"/>
+                <w:bCs w:val="false"/>
+                <w:sz w:val="20"/>
+                <w:szCs w:val="20"/>
+              </w:rPr>
+              <w:t xml:space="preserve">−49,4</w:t>
             </w:r>
           </w:p>
         </w:tc>
@@ -8747,73 +8747,7 @@
                 <w:sz w:val="20"/>
                 <w:szCs w:val="20"/>
               </w:rPr>
-              <w:t xml:space="preserve">+103,7</w:t>
-            </w:r>
-          </w:p>
-        </w:tc>
-        <w:tc>
-          <w:tcPr>
-            <w:tcW w:type="dxa" w:w="1045"/>
-            <w:tcBorders>
-              <w:top w:val="none" w:color="FFFFFF" w:sz="0"/>
-              <w:left w:val="none" w:color="FFFFFF" w:sz="0"/>
-              <w:bottom w:val="none" w:color="FFFFFF" w:sz="0"/>
-              <w:right w:val="none" w:color="FFFFFF" w:sz="0"/>
-            </w:tcBorders>
-            <w:tcMar>
-              <w:top w:type="dxa" w:w="40"/>
-              <w:left w:type="dxa" w:w="80"/>
-              <w:bottom w:type="dxa" w:w="40"/>
-              <w:right w:type="dxa" w:w="80"/>
-            </w:tcMar>
-          </w:tcPr>
-          <w:p>
-            <w:pPr>
-              <w:spacing w:line="240"/>
-              <w:jc w:val="center"/>
-            </w:pPr>
-            <w:r>
-              <w:rPr>
-                <w:rFonts w:ascii="Times New Roman" w:cs="Times New Roman" w:eastAsia="Times New Roman" w:hAnsi="Times New Roman"/>
-                <w:b w:val="false"/>
-                <w:bCs w:val="false"/>
-                <w:sz w:val="20"/>
-                <w:szCs w:val="20"/>
-              </w:rPr>
-              <w:t xml:space="preserve">0,002</w:t>
-            </w:r>
-          </w:p>
-        </w:tc>
-        <w:tc>
-          <w:tcPr>
-            <w:tcW w:type="dxa" w:w="1045"/>
-            <w:tcBorders>
-              <w:top w:val="none" w:color="FFFFFF" w:sz="0"/>
-              <w:left w:val="none" w:color="FFFFFF" w:sz="0"/>
-              <w:bottom w:val="none" w:color="FFFFFF" w:sz="0"/>
-              <w:right w:val="none" w:color="FFFFFF" w:sz="0"/>
-            </w:tcBorders>
-            <w:tcMar>
-              <w:top w:type="dxa" w:w="40"/>
-              <w:left w:type="dxa" w:w="80"/>
-              <w:bottom w:type="dxa" w:w="40"/>
-              <w:right w:type="dxa" w:w="80"/>
-            </w:tcMar>
-          </w:tcPr>
-          <w:p>
-            <w:pPr>
-              <w:spacing w:line="240"/>
-              <w:jc w:val="center"/>
-            </w:pPr>
-            <w:r>
-              <w:rPr>
-                <w:rFonts w:ascii="Times New Roman" w:cs="Times New Roman" w:eastAsia="Times New Roman" w:hAnsi="Times New Roman"/>
-                <w:b w:val="false"/>
-                <w:bCs w:val="false"/>
-                <w:sz w:val="20"/>
-                <w:szCs w:val="20"/>
-              </w:rPr>
-              <w:t xml:space="preserve">−44,5</w:t>
+              <w:t xml:space="preserve">+95,0</w:t>
             </w:r>
           </w:p>
         </w:tc>
@@ -8879,7 +8813,7 @@
                 <w:sz w:val="20"/>
                 <w:szCs w:val="20"/>
               </w:rPr>
-              <w:t xml:space="preserve">−48,2</w:t>
+              <w:t xml:space="preserve">−46,5</w:t>
             </w:r>
           </w:p>
         </w:tc>
@@ -8912,7 +8846,73 @@
                 <w:sz w:val="20"/>
                 <w:szCs w:val="20"/>
               </w:rPr>
-              <w:t xml:space="preserve">0,003</w:t>
+              <w:t xml:space="preserve">0,014</w:t>
+            </w:r>
+          </w:p>
+        </w:tc>
+        <w:tc>
+          <w:tcPr>
+            <w:tcW w:type="dxa" w:w="1045"/>
+            <w:tcBorders>
+              <w:top w:val="none" w:color="FFFFFF" w:sz="0"/>
+              <w:left w:val="none" w:color="FFFFFF" w:sz="0"/>
+              <w:bottom w:val="none" w:color="FFFFFF" w:sz="0"/>
+              <w:right w:val="none" w:color="FFFFFF" w:sz="0"/>
+            </w:tcBorders>
+            <w:tcMar>
+              <w:top w:type="dxa" w:w="40"/>
+              <w:left w:type="dxa" w:w="80"/>
+              <w:bottom w:type="dxa" w:w="40"/>
+              <w:right w:type="dxa" w:w="80"/>
+            </w:tcMar>
+          </w:tcPr>
+          <w:p>
+            <w:pPr>
+              <w:spacing w:line="240"/>
+              <w:jc w:val="center"/>
+            </w:pPr>
+            <w:r>
+              <w:rPr>
+                <w:rFonts w:ascii="Times New Roman" w:cs="Times New Roman" w:eastAsia="Times New Roman" w:hAnsi="Times New Roman"/>
+                <w:b w:val="false"/>
+                <w:bCs w:val="false"/>
+                <w:sz w:val="20"/>
+                <w:szCs w:val="20"/>
+              </w:rPr>
+              <w:t xml:space="preserve">−48,5</w:t>
+            </w:r>
+          </w:p>
+        </w:tc>
+        <w:tc>
+          <w:tcPr>
+            <w:tcW w:type="dxa" w:w="1045"/>
+            <w:tcBorders>
+              <w:top w:val="none" w:color="FFFFFF" w:sz="0"/>
+              <w:left w:val="none" w:color="FFFFFF" w:sz="0"/>
+              <w:bottom w:val="none" w:color="FFFFFF" w:sz="0"/>
+              <w:right w:val="none" w:color="FFFFFF" w:sz="0"/>
+            </w:tcBorders>
+            <w:tcMar>
+              <w:top w:type="dxa" w:w="40"/>
+              <w:left w:type="dxa" w:w="80"/>
+              <w:bottom w:type="dxa" w:w="40"/>
+              <w:right w:type="dxa" w:w="80"/>
+            </w:tcMar>
+          </w:tcPr>
+          <w:p>
+            <w:pPr>
+              <w:spacing w:line="240"/>
+              <w:jc w:val="center"/>
+            </w:pPr>
+            <w:r>
+              <w:rPr>
+                <w:rFonts w:ascii="Times New Roman" w:cs="Times New Roman" w:eastAsia="Times New Roman" w:hAnsi="Times New Roman"/>
+                <w:b w:val="false"/>
+                <w:bCs w:val="false"/>
+                <w:sz w:val="20"/>
+                <w:szCs w:val="20"/>
+              </w:rPr>
+              <w:t xml:space="preserve">0,001</w:t>
             </w:r>
           </w:p>
         </w:tc>
@@ -8984,7 +8984,7 @@
                 <w:sz w:val="20"/>
                 <w:szCs w:val="20"/>
               </w:rPr>
-              <w:t xml:space="preserve">+81,3</w:t>
+              <w:t xml:space="preserve">+72,3</w:t>
             </w:r>
           </w:p>
         </w:tc>
@@ -9017,7 +9017,7 @@
                 <w:sz w:val="20"/>
                 <w:szCs w:val="20"/>
               </w:rPr>
-              <w:t xml:space="preserve">0,002</w:t>
+              <w:t xml:space="preserve">&lt; 0,001</w:t>
             </w:r>
           </w:p>
         </w:tc>
@@ -9050,7 +9050,7 @@
                 <w:sz w:val="20"/>
                 <w:szCs w:val="20"/>
               </w:rPr>
-              <w:t xml:space="preserve">−40,3</w:t>
+              <w:t xml:space="preserve">−41,1</w:t>
             </w:r>
           </w:p>
         </w:tc>
@@ -9083,7 +9083,7 @@
                 <w:sz w:val="20"/>
                 <w:szCs w:val="20"/>
               </w:rPr>
-              <w:t xml:space="preserve">0,006</w:t>
+              <w:t xml:space="preserve">0,004</w:t>
             </w:r>
           </w:p>
         </w:tc>
@@ -9116,7 +9116,7 @@
                 <w:sz w:val="20"/>
                 <w:szCs w:val="20"/>
               </w:rPr>
-              <w:t xml:space="preserve">−43,7</w:t>
+              <w:t xml:space="preserve">−44,4</w:t>
             </w:r>
           </w:p>
         </w:tc>
@@ -9149,7 +9149,7 @@
                 <w:sz w:val="20"/>
                 <w:szCs w:val="20"/>
               </w:rPr>
-              <w:t xml:space="preserve">0,007</w:t>
+              <w:t xml:space="preserve">0,011</w:t>
             </w:r>
           </w:p>
         </w:tc>
@@ -9221,7 +9221,7 @@
                 <w:sz w:val="20"/>
                 <w:szCs w:val="20"/>
               </w:rPr>
-              <w:t xml:space="preserve">+10,4</w:t>
+              <w:t xml:space="preserve">+10,9</w:t>
             </w:r>
           </w:p>
         </w:tc>
@@ -9254,7 +9254,7 @@
                 <w:sz w:val="20"/>
                 <w:szCs w:val="20"/>
               </w:rPr>
-              <w:t xml:space="preserve">0,059</w:t>
+              <w:t xml:space="preserve">0,001</w:t>
             </w:r>
           </w:p>
         </w:tc>
@@ -9287,7 +9287,7 @@
                 <w:sz w:val="20"/>
                 <w:szCs w:val="20"/>
               </w:rPr>
-              <w:t xml:space="preserve">−4,9</w:t>
+              <w:t xml:space="preserve">−3,6</w:t>
             </w:r>
           </w:p>
         </w:tc>
@@ -9320,7 +9320,7 @@
                 <w:sz w:val="20"/>
                 <w:szCs w:val="20"/>
               </w:rPr>
-              <w:t xml:space="preserve">&lt; 0,001</w:t>
+              <w:t xml:space="preserve">0,003</w:t>
             </w:r>
           </w:p>
         </w:tc>
@@ -9353,7 +9353,7 @@
                 <w:sz w:val="20"/>
                 <w:szCs w:val="20"/>
               </w:rPr>
-              <w:t xml:space="preserve">−2,2</w:t>
+              <w:t xml:space="preserve">−2,1</w:t>
             </w:r>
           </w:p>
         </w:tc>
@@ -9386,7 +9386,7 @@
                 <w:sz w:val="20"/>
                 <w:szCs w:val="20"/>
               </w:rPr>
-              <w:t xml:space="preserve">0,019</w:t>
+              <w:t xml:space="preserve">0,037</w:t>
             </w:r>
           </w:p>
         </w:tc>
@@ -9453,7 +9453,7 @@
           <w:sz w:val="24"/>
           <w:szCs w:val="24"/>
         </w:rPr>
-        <w:t xml:space="preserve">A Tabela 3 e a Figura 2 detalham a latência média e o percentil 95 por endpoint.</w:t>
+        <w:t xml:space="preserve">A Tabela 3 e a Figura 2 detalham a latência média e o percentil 95 por endpoint, também no patamar.</w:t>
       </w:r>
     </w:p>
     <w:p>
@@ -9728,7 +9728,7 @@
                 <w:sz w:val="20"/>
                 <w:szCs w:val="20"/>
               </w:rPr>
-              <w:t xml:space="preserve">529,0 / 775,2</w:t>
+              <w:t xml:space="preserve">684,2 / 780,2</w:t>
             </w:r>
           </w:p>
         </w:tc>
@@ -9761,7 +9761,7 @@
                 <w:sz w:val="20"/>
                 <w:szCs w:val="20"/>
               </w:rPr>
-              <w:t xml:space="preserve">536,8 / 781,0</w:t>
+              <w:t xml:space="preserve">691,3 / 784,7</w:t>
             </w:r>
           </w:p>
         </w:tc>
@@ -9794,7 +9794,7 @@
                 <w:sz w:val="20"/>
                 <w:szCs w:val="20"/>
               </w:rPr>
-              <w:t xml:space="preserve">527,8 / 775,6</w:t>
+              <w:t xml:space="preserve">683,7 / 780,5</w:t>
             </w:r>
           </w:p>
         </w:tc>
@@ -9827,7 +9827,7 @@
                 <w:sz w:val="20"/>
                 <w:szCs w:val="20"/>
               </w:rPr>
-              <w:t xml:space="preserve">565,3 / 794,5</w:t>
+              <w:t xml:space="preserve">721,3 / 798,2</w:t>
             </w:r>
           </w:p>
         </w:tc>
@@ -9899,7 +9899,7 @@
                 <w:sz w:val="20"/>
                 <w:szCs w:val="20"/>
               </w:rPr>
-              <w:t xml:space="preserve">482,2 / 697,3</w:t>
+              <w:t xml:space="preserve">625,3 / 702,9</w:t>
             </w:r>
           </w:p>
         </w:tc>
@@ -9932,7 +9932,7 @@
                 <w:sz w:val="20"/>
                 <w:szCs w:val="20"/>
               </w:rPr>
-              <w:t xml:space="preserve">492,1 / 700,9</w:t>
+              <w:t xml:space="preserve">634,2 / 706,4</w:t>
             </w:r>
           </w:p>
         </w:tc>
@@ -9965,7 +9965,7 @@
                 <w:sz w:val="20"/>
                 <w:szCs w:val="20"/>
               </w:rPr>
-              <w:t xml:space="preserve">484,2 / 697,3</w:t>
+              <w:t xml:space="preserve">625,0 / 702,6</w:t>
             </w:r>
           </w:p>
         </w:tc>
@@ -9998,7 +9998,7 @@
                 <w:sz w:val="20"/>
                 <w:szCs w:val="20"/>
               </w:rPr>
-              <w:t xml:space="preserve">525,4 / 754,5</w:t>
+              <w:t xml:space="preserve">669,2 / 763,2</w:t>
             </w:r>
           </w:p>
         </w:tc>
@@ -10092,7 +10092,7 @@
                 <w:sz w:val="20"/>
                 <w:szCs w:val="20"/>
               </w:rPr>
-              <w:t xml:space="preserve">436,8 / 648,9</w:t>
+              <w:t xml:space="preserve">558,7 / 667,2</w:t>
             </w:r>
           </w:p>
         </w:tc>
@@ -10125,7 +10125,7 @@
                 <w:sz w:val="20"/>
                 <w:szCs w:val="20"/>
               </w:rPr>
-              <w:t xml:space="preserve">439,9 / 652,9</w:t>
+              <w:t xml:space="preserve">562,9 / 670,6</w:t>
             </w:r>
           </w:p>
         </w:tc>
@@ -10158,7 +10158,7 @@
                 <w:sz w:val="20"/>
                 <w:szCs w:val="20"/>
               </w:rPr>
-              <w:t xml:space="preserve">436,5 / 648,9</w:t>
+              <w:t xml:space="preserve">558,9 / 666,5</w:t>
             </w:r>
           </w:p>
         </w:tc>
@@ -10191,7 +10191,7 @@
                 <w:sz w:val="20"/>
                 <w:szCs w:val="20"/>
               </w:rPr>
-              <w:t xml:space="preserve">456,9 / 674,9</w:t>
+              <w:t xml:space="preserve">579,4 / 688,5</w:t>
             </w:r>
           </w:p>
         </w:tc>
@@ -10263,7 +10263,7 @@
                 <w:sz w:val="20"/>
                 <w:szCs w:val="20"/>
               </w:rPr>
-              <w:t xml:space="preserve">241,3 / 392,0</w:t>
+              <w:t xml:space="preserve">324,3 / 396,1</w:t>
             </w:r>
           </w:p>
         </w:tc>
@@ -10296,7 +10296,7 @@
                 <w:sz w:val="20"/>
                 <w:szCs w:val="20"/>
               </w:rPr>
-              <w:t xml:space="preserve">251,1 / 397,1</w:t>
+              <w:t xml:space="preserve">336,2 / 400,4</w:t>
             </w:r>
           </w:p>
         </w:tc>
@@ -10329,7 +10329,7 @@
                 <w:sz w:val="20"/>
                 <w:szCs w:val="20"/>
               </w:rPr>
-              <w:t xml:space="preserve">241,3 / 392,1</w:t>
+              <w:t xml:space="preserve">324,1 / 396,2</w:t>
             </w:r>
           </w:p>
         </w:tc>
@@ -10362,7 +10362,7 @@
                 <w:sz w:val="20"/>
                 <w:szCs w:val="20"/>
               </w:rPr>
-              <w:t xml:space="preserve">242,2 / 392,7</w:t>
+              <w:t xml:space="preserve">326,1 / 396,7</w:t>
             </w:r>
           </w:p>
         </w:tc>
@@ -10434,7 +10434,7 @@
                 <w:sz w:val="20"/>
                 <w:szCs w:val="20"/>
               </w:rPr>
-              <w:t xml:space="preserve">217,5 / 331,1</w:t>
+              <w:t xml:space="preserve">291,6 / 379,1</w:t>
             </w:r>
           </w:p>
         </w:tc>
@@ -10467,7 +10467,7 @@
                 <w:sz w:val="20"/>
                 <w:szCs w:val="20"/>
               </w:rPr>
-              <w:t xml:space="preserve">228,1 / 382,7</w:t>
+              <w:t xml:space="preserve">304,4 / 388,9</w:t>
             </w:r>
           </w:p>
         </w:tc>
@@ -10500,7 +10500,7 @@
                 <w:sz w:val="20"/>
                 <w:szCs w:val="20"/>
               </w:rPr>
-              <w:t xml:space="preserve">217,2 / 328,7</w:t>
+              <w:t xml:space="preserve">291,4 / 378,6</w:t>
             </w:r>
           </w:p>
         </w:tc>
@@ -10533,7 +10533,7 @@
                 <w:sz w:val="20"/>
                 <w:szCs w:val="20"/>
               </w:rPr>
-              <w:t xml:space="preserve">219,7 / 367,4</w:t>
+              <w:t xml:space="preserve">294,1 / 381,2</w:t>
             </w:r>
           </w:p>
         </w:tc>
@@ -10673,7 +10673,7 @@
           <w:sz w:val="24"/>
           <w:szCs w:val="24"/>
         </w:rPr>
-        <w:t xml:space="preserve"> gere e serialize mil registros. A explicação é a forma de carga: o k6 mantém 100 usuários virtuais disparando requisições continuamente, sem tempo de espera entre elas, e o servidor, limitado a 1 CPU, está saturado (Seção 4.4). Nessa condição, o tempo de resposta é dominado pelo tempo de fila e, pela Lei de Little (LITTLE, 1961), a latência média em um sistema fechado aproxima-se de usuários ÷ vazão. A conta confere: 100 ÷ 143,7 ≈ 696 ms no cenário A (p50 medido: 687 ms), 100 ÷ 318,1 ≈ 314 ms no cenário C (300 ms) e 100 ÷ 351,3 ≈ 285 ms no cenário D (288 ms). Consequentemente, a latência aqui é um espelho da vazão, e não uma medida independente do custo de cada endpoint. A diferença entre </w:t>
+        <w:t xml:space="preserve"> gere e serialize mil registros. A explicação é a forma de carga: o k6 mantém 100 usuários virtuais disparando requisições continuamente, sem tempo de espera entre elas, e o servidor, limitado a 1 CPU, está saturado (Seção 4.4). Nessa condição, o tempo de resposta é dominado pelo tempo de fila e, pela Lei de Little (LITTLE, 1961), a latência média em um sistema fechado aproxima-se de usuários ÷ vazão. A conta confere: 100 ÷ 143,2 ≈ 698 ms no cenário A (latência média medida: 697 ms), 100 ÷ 303,9 ≈ 329 ms no cenário C (328 ms) e 100 ÷ 336,9 ≈ 297 ms no cenário D (296 ms). Consequentemente, a latência aqui é um espelho da vazão, e não uma medida independente do custo de cada endpoint. A diferença entre </w:t>
       </w:r>
       <w:r>
         <w:rPr>
@@ -10705,7 +10705,7 @@
           <w:sz w:val="24"/>
           <w:szCs w:val="24"/>
         </w:rPr>
-        <w:t xml:space="preserve"> é pequena em todos os cenários: 36 ms no cenário A, 43 ms no B, 20 ms no E, 1 ms no C e 2 ms no D. Ela é maior nos cenários que abrem uma nova conexão a cada requisição (A, B, E) do que nos que a reaproveitam (C e D), o que é coerente com o Quadro 1, mas o desenho do experimento não isola o custo de cada endpoint com precisão. Para isso seria necessária carga com taxa de chegada fixa (modelo aberto), tema indicado nos trabalhos futuros.</w:t>
+        <w:t xml:space="preserve"> é pequena em todos os cenários: 37 ms no cenário A, 44 ms no B, 21 ms no E, 2 ms no C e 2,5 ms no D. Ela é maior nos cenários que abrem uma nova conexão a cada requisição (A, B, E) do que nos que a reaproveitam (C e D), o que é coerente com o Quadro 1, mas o desenho do experimento não isola o custo de cada endpoint com precisão. Para isso seria necessária carga com taxa de chegada fixa (modelo aberto), tema indicado nos trabalhos futuros.</w:t>
       </w:r>
     </w:p>
     <w:p>
@@ -12106,7 +12106,7 @@
                 <w:sz w:val="20"/>
                 <w:szCs w:val="20"/>
               </w:rPr>
-              <w:t xml:space="preserve">310,1</w:t>
+              <w:t xml:space="preserve">304,4</w:t>
             </w:r>
           </w:p>
         </w:tc>
@@ -12139,7 +12139,7 @@
                 <w:sz w:val="20"/>
                 <w:szCs w:val="20"/>
               </w:rPr>
-              <w:t xml:space="preserve">396,1</w:t>
+              <w:t xml:space="preserve">397,5</w:t>
             </w:r>
           </w:p>
         </w:tc>
@@ -12172,7 +12172,7 @@
                 <w:sz w:val="20"/>
                 <w:szCs w:val="20"/>
               </w:rPr>
-              <w:t xml:space="preserve">406,7</w:t>
+              <w:t xml:space="preserve">407,6</w:t>
             </w:r>
           </w:p>
         </w:tc>
@@ -12343,7 +12343,7 @@
                 <w:sz w:val="20"/>
                 <w:szCs w:val="20"/>
               </w:rPr>
-              <w:t xml:space="preserve">346,8</w:t>
+              <w:t xml:space="preserve">340,6</w:t>
             </w:r>
           </w:p>
         </w:tc>
@@ -12376,7 +12376,7 @@
                 <w:sz w:val="20"/>
                 <w:szCs w:val="20"/>
               </w:rPr>
-              <w:t xml:space="preserve">376,5</w:t>
+              <w:t xml:space="preserve">380,0</w:t>
             </w:r>
           </w:p>
         </w:tc>
@@ -12409,7 +12409,7 @@
                 <w:sz w:val="20"/>
                 <w:szCs w:val="20"/>
               </w:rPr>
-              <w:t xml:space="preserve">397,0</w:t>
+              <w:t xml:space="preserve">398,2</w:t>
             </w:r>
           </w:p>
         </w:tc>
@@ -12632,7 +12632,7 @@
           <w:sz w:val="24"/>
           <w:szCs w:val="24"/>
         </w:rPr>
-        <w:t xml:space="preserve">Nos dois cenários a memória se manteve estável durante os 30 minutos, com variação de menos de 1 MiB entre o início e o fim do patamar, e a vazão e a latência ficaram no mesmo nível das execuções de 15 minutos (vazão 2,5% menor no C e 1,3% menor no D). Portanto, não houve evidência de acúmulo de memória nem de degradação de desempenho no modo Worker nem no CodeIgniter 4 nem no Laravel Octane, o que é relevante para a adoção do modo Worker em produção, em que o risco de vazamento entre requisições é a principal contrapartida (DUNGLAS, 2024). A estabilidade em 30 minutos, com 4 </w:t>
+        <w:t xml:space="preserve">Nos dois cenários a memória se manteve estável durante os 30 minutos, com variação de menos de 1 MiB entre o início e o fim do patamar, e a vazão e a latência ficaram no mesmo nível das execuções de 15 minutos (vazão 0,2% maior no C e 1,1% maior no D). Portanto, não houve evidência de acúmulo de memória nem de degradação de desempenho no modo Worker nem no CodeIgniter 4 nem no Laravel Octane, o que é relevante para a adoção do modo Worker em produção, em que o risco de vazamento entre requisições é a principal contrapartida (DUNGLAS, 2024). A estabilidade em 30 minutos, com 4 </w:t>
       </w:r>
       <w:r>
         <w:rPr>
@@ -13354,7 +13354,7 @@
           <w:sz w:val="24"/>
           <w:szCs w:val="24"/>
         </w:rPr>
-        <w:t xml:space="preserve"> carregados em memória mais que dobrou a vazão do CodeIgniter 4 (C em relação a A, +121,4%) e reduziu pela metade o p95 e o p99, com os mesmos recursos e sem perda de estabilidade (Seção 4.5). Isso é coerente com a motivação do trabalho: no modelo tradicional, a inicialização do </w:t>
+        <w:t xml:space="preserve"> carregados em memória mais que dobrou a vazão do CodeIgniter 4 (C em relação a A, +112,2%) e reduziu pela metade o p95 e o p99, com os mesmos recursos e sem perda de estabilidade (Seção 4.5). Essa é a comparação entre duas arquiteturas completas (servidor, compilação do PHP e divisão de recursos diferentes); a comparação que mais isola o modo Worker é a de C com B, que usam o mesmo FrankenPHP e quatro unidades de concorrência (+95,0% de vazão). Isso é coerente com a motivação do trabalho: no modelo tradicional, a inicialização do </w:t>
       </w:r>
       <w:r>
         <w:rPr>
@@ -13451,7 +13451,7 @@
           <w:sz w:val="24"/>
           <w:szCs w:val="24"/>
         </w:rPr>
-        <w:t xml:space="preserve"> O FrankenPHP em modo clássico (B) superou o PHP-FPM (A) em 8,7% de vazão e 9,6% de p95, mas não no p99 (−2,2%, sem significância), e ficou 51% abaixo do cenário C. O cenário B é a comparação mais direta com o A, pois ambos reiniciam estado e conexão a cada requisição (Quadro 1). Sem o cenário B, o ganho do cenário C poderia ser atribuído erroneamente ao FrankenPHP em si, quando decorre sobretudo do modo Worker. Neste experimento não investigamos a causa do pequeno ganho de B sobre A; uma hipótese é que o FrankenPHP dispensa o salto FastCGI entre Nginx e PHP-FPM e a divisão da cota de CPU entre dois contêineres (Seção 4.4), compensada em parte pelo uso de PHP </w:t>
+        <w:t xml:space="preserve"> O FrankenPHP em modo clássico (B) superou o PHP-FPM (A) em 8,8% de vazão, mas não de modo significativo no p95 (−5,9%) nem no p99 (−1,7%), e ficou 49% abaixo do cenário C. O cenário B é a comparação mais direta com o A, pois ambos reiniciam estado e conexão a cada requisição (Quadro 1). Sem o cenário B, o ganho do cenário C poderia ser atribuído erroneamente ao FrankenPHP em si, quando decorre sobretudo do modo Worker. Neste experimento não investigamos a causa do pequeno ganho de B sobre A; uma hipótese é que o FrankenPHP dispensa o salto FastCGI entre Nginx e PHP-FPM e a divisão da cota de CPU entre dois contêineres (Seção 4.4), compensada em parte pelo uso de PHP </w:t>
       </w:r>
       <w:r>
         <w:rPr>
@@ -13487,7 +13487,7 @@
           <w:sz w:val="24"/>
           <w:szCs w:val="24"/>
         </w:rPr>
-        <w:t xml:space="preserve"> do servidor, elevou a vazão em 12,4% em relação ao B, o que mostra que o resultado do modo clássico depende dessa configuração: mesmo assim, E ficou 45% abaixo do cenário C em vazão. A conclusão de que o modo Worker é o que determina o ganho vale, portanto, para as duas configurações do modo clássico.</w:t>
+        <w:t xml:space="preserve"> do servidor, elevou a vazão em 13,2% em relação ao B, o que mostra que o resultado do modo clássico depende dessa configuração: mesmo assim, E ficou 42% abaixo do cenário C em vazão. A conclusão de que o modo Worker é o que determina o ganho vale, portanto, para as duas configurações do modo clássico.</w:t>
       </w:r>
     </w:p>
     <w:p>
@@ -13512,7 +13512,7 @@
           <w:sz w:val="24"/>
           <w:szCs w:val="24"/>
         </w:rPr>
-        <w:t xml:space="preserve"> O Laravel Octane (D) superou o CodeIgniter 4 em modo Worker (C) em 10,4% de vazão (351,3 contra 318,1 RPS) e 4,9% de p95, diferença menor que a que separa qualquer cenário clássico do modo Worker e que não é significativa na vazão após a correção de Bonferroni (Tabela 2). O resultado diverge da expectativa implícita no problema de pesquisa, de que o CodeIgniter, por ser mais leve, aproveitaria melhor o modo Worker: ele ficou 9,5% abaixo do Octane, e com menos memória (125 contra 172 MiB, Tabela 4). Duas observações ajudam a interpretar: (i) o Octane é um pacote maduro, projetado para esse modelo de execução e que já trata a limpeza de estado entre requisições (OTWELL, 2024), enquanto o suporte nativo do CodeIgniter ao modo Worker é recente (CODEIGNITER FOUNDATION, 2024); e (ii) o diagnóstico mostrou que os dois preservam estado e conexão, de modo que a diferença remanescente não decorre da persistência da conexão. Não foi feito perfilamento do código, de modo que as causas permanecem hipóteses; o que os dados sustentam é a diferença de vazão, o comportamento da memória e a equivalência de estado preservado.</w:t>
+        <w:t xml:space="preserve"> O Laravel Octane (D) superou o CodeIgniter 4 em modo Worker (C) em 10,9% de vazão (336,9 contra 303,9 RPS) e 3,6% de p95, diferença menor que a que separa qualquer cenário clássico do modo Worker, mas significativa na vazão mesmo após a correção de Bonferroni (Tabela 2), e relativa a duas implementações específicas, sob uma carga e uma configuração particulares. O resultado diverge da expectativa implícita no problema de pesquisa, de que o CodeIgniter, por ser mais leve, aproveitaria melhor o modo Worker: ele ficou 9,8% abaixo do Octane, e com menos memória (125 contra 172 MiB, Tabela 4). Duas observações ajudam a interpretar: (i) o Octane é um pacote maduro, projetado para esse modelo de execução e que já trata a limpeza de estado entre requisições (OTWELL, 2024), enquanto o suporte nativo do CodeIgniter ao modo Worker é recente (CODEIGNITER FOUNDATION, 2024); e (ii) o diagnóstico mostrou que os dois preservam estado e conexão, de modo que a diferença remanescente não decorre da persistência da conexão. Não foi feito perfilamento do código, de modo que as causas permanecem hipóteses; o que os dados sustentam é a diferença de vazão, o comportamento da memória e a equivalência de estado preservado.</w:t>
       </w:r>
     </w:p>
     <w:p>
@@ -13537,7 +13537,7 @@
           <w:sz w:val="24"/>
           <w:szCs w:val="24"/>
         </w:rPr>
-        <w:t xml:space="preserve"> A decisão de repetir cada cenário três vezes, em ordem rotativa, de manter a mesma base de sistema operacional em todos eles e de reportar o desvio-padrão segue a recomendação da literatura de que benchmarks de software sofrem instabilidade e devem ser tratados com repetição e controle do ambiente (LAABER; BASMACI; SALZA, 2021), e a de que comparações de desempenho exigem condições idênticas de execução (ZHAN, 2022; BRUNST et al., 2022; JIA et al., 2013). O desvio-padrão baixo observado (no máximo 1,9% da média) indica que o ambiente conteinerizado, com limites estritos de CPU e memória, produziu medições estáveis.</w:t>
+        <w:t xml:space="preserve"> A decisão de repetir cada cenário três vezes, em ordem rotativa, de manter a mesma base de sistema operacional em todos eles e de reportar o desvio-padrão segue a recomendação da literatura de que benchmarks de software sofrem instabilidade e devem ser tratados com repetição e controle do ambiente (LAABER; BASMACI; SALZA, 2021), e a de que comparações de desempenho exigem condições idênticas de execução (ZHAN, 2022; BRUNST et al., 2022; JIA et al., 2013). O desvio-padrão baixo observado (no máximo 1,0% da média) indica que o ambiente conteinerizado, com limites estritos de CPU e memória, produziu medições estáveis.</w:t>
       </w:r>
     </w:p>
     <w:p>
@@ -13688,7 +13688,40 @@
           <w:sz w:val="24"/>
           <w:szCs w:val="24"/>
         </w:rPr>
-        <w:t xml:space="preserve"> com três execuções por cenário, os testes estatísticos têm poder limitado, e a diferença entre C e D, de 10,4% na vazão, não resiste à correção de Bonferroni.</w:t>
+        <w:t xml:space="preserve"> com três execuções por cenário, os testes estatísticos têm poder limitado e a normalidade não pode ser verificada; as diferenças de p95 e p99 de B sobre A e de E sobre B não são significativas.</w:t>
+      </w:r>
+    </w:p>
+    <w:p>
+      <w:pPr>
+        <w:spacing w:after="0" w:before="0" w:line="360" w:lineRule="auto"/>
+        <w:ind w:left="1066" w:hanging="357"/>
+        <w:jc w:val="both"/>
+      </w:pPr>
+      <w:r>
+        <w:rPr>
+          <w:rFonts w:ascii="Times New Roman" w:cs="Times New Roman" w:eastAsia="Times New Roman" w:hAnsi="Times New Roman"/>
+          <w:sz w:val="24"/>
+          <w:szCs w:val="24"/>
+        </w:rPr>
+        <w:t xml:space="preserve">–  </w:t>
+      </w:r>
+      <w:r>
+        <w:rPr>
+          <w:rFonts w:ascii="Times New Roman" w:cs="Times New Roman" w:eastAsia="Times New Roman" w:hAnsi="Times New Roman"/>
+          <w:b/>
+          <w:bCs/>
+          <w:sz w:val="24"/>
+          <w:szCs w:val="24"/>
+        </w:rPr>
+        <w:t xml:space="preserve">Carga única:</w:t>
+      </w:r>
+      <w:r>
+        <w:rPr>
+          <w:rFonts w:ascii="Times New Roman" w:cs="Times New Roman" w:eastAsia="Times New Roman" w:hAnsi="Times New Roman"/>
+          <w:sz w:val="24"/>
+          <w:szCs w:val="24"/>
+        </w:rPr>
+        <w:t xml:space="preserve"> a vazão foi medida apenas com 100 usuários virtuais, sem varredura de concorrência; por isso é a vazão observada nessa carga, e não se demonstra que seja o máximo de cada cenário.</w:t>
       </w:r>
     </w:p>
     <w:p>
@@ -13925,7 +13958,7 @@
           <w:sz w:val="24"/>
           <w:szCs w:val="24"/>
         </w:rPr>
-        <w:t xml:space="preserve">Quanto ao primeiro objetivo específico, montar um ambiente experimental conteinerizado e reprodutível, com limites idênticos de CPU e memória, o experimento foi concluído com Docker Compose, limites estritos de recursos, imagens de aplicação e servidor web com a mesma base (Debian 13) e as mesmas versões de PHP, k6 como injetor e Prometheus e Grafana na observação. Ele produziu medições estáveis, com desvio-padrão de no máximo 1,9% da média em três execuções por cenário e 0,00% de erros.</w:t>
+        <w:t xml:space="preserve">Quanto ao primeiro objetivo específico, montar um ambiente experimental conteinerizado e reprodutível, com limites idênticos de CPU e memória, o experimento foi concluído com Docker Compose, limites estritos de recursos, imagens de aplicação e servidor web com a mesma base (Debian 13) e as mesmas versões de PHP, k6 como injetor e Prometheus e Grafana na observação. Ele produziu medições estáveis, com desvio-padrão de no máximo 1,0% da média em três execuções por cenário e 0,00% de erros.</w:t>
       </w:r>
     </w:p>
     <w:p>
@@ -13940,7 +13973,7 @@
           <w:sz w:val="24"/>
           <w:szCs w:val="24"/>
         </w:rPr>
-        <w:t xml:space="preserve">Quanto ao segundo, medir e comparar vazão e latência, os resultados mostram que o modo Worker do FrankenPHP elevou a vazão do CodeIgniter 4 em 121,4% em relação ao PHP-FPM (318,1 contra 143,7 RPS) e reduziu o p95 de 785,6 para 394,1 ms e o p99 de 800,5 para 405,7 ms. O FrankenPHP em modo clássico entregou ganho modesto sobre o PHP-FPM (+8,7% de vazão com 4 </w:t>
+        <w:t xml:space="preserve">Quanto ao segundo, medir e comparar vazão e latência, os resultados mostram que o modo Worker do FrankenPHP elevou a vazão do CodeIgniter 4 em 112,2% em relação ao PHP-FPM (303,9 contra 143,2 RPS, no patamar de 10 minutos sob 100 usuários virtuais) e reduziu o p95 de 789,7 para 397,9 ms e o p99 de 807,2 para 408,3 ms; em relação ao FrankenPHP clássico, que usa o mesmo servidor, o ganho de vazão foi de 95,0%. O FrankenPHP em modo clássico entregou ganho modesto sobre o PHP-FPM (+8,8% de vazão com 4 </w:t>
       </w:r>
       <w:r>
         <w:rPr>
@@ -13958,7 +13991,7 @@
           <w:sz w:val="24"/>
           <w:szCs w:val="24"/>
         </w:rPr>
-        <w:t xml:space="preserve"> e +22,1% com o número padrão de </w:t>
+        <w:t xml:space="preserve"> e +23,2% com o número padrão de </w:t>
       </w:r>
       <w:r>
         <w:rPr>
@@ -13976,7 +14009,7 @@
           <w:sz w:val="24"/>
           <w:szCs w:val="24"/>
         </w:rPr>
-        <w:t xml:space="preserve">), muito inferior ao do modo Worker. O Laravel Octane obteve a maior vazão (351,3 RPS), 10,4% acima do CodeIgniter 4 em modo Worker, diferença que, com apenas três execuções por cenário, não resistiu à correção de Bonferroni.</w:t>
+        <w:t xml:space="preserve">), muito inferior ao do modo Worker. O Laravel Octane obteve a maior vazão (336,9 RPS), 10,9% acima do CodeIgniter 4 em modo Worker, diferença pequena que, ainda assim, resistiu à correção de Bonferroni (p ajustado = 0,001), mas é relativa a duas implementações específicas.</w:t>
       </w:r>
     </w:p>
     <w:p>
@@ -14191,7 +14224,7 @@
           <w:sz w:val="24"/>
           <w:szCs w:val="24"/>
         </w:rPr>
-        <w:t xml:space="preserve">Entre as limitações, destacam-se: execução em um único hospedeiro, com o injetor de carga na mesma máquina; carga sintética em modelo fechado, que satura o servidor e faz a latência refletir a vazão; apenas três execuções por cenário, o que limita o poder estatístico; diferença de compilação do PHP (</w:t>
+        <w:t xml:space="preserve">Entre as limitações, destacam-se: execução em um único hospedeiro, com o injetor de carga na mesma máquina; carga sintética em modelo fechado, que satura o servidor e faz a latência refletir a vazão, e com uma única concorrência (100 usuários virtuais), de modo que se mede a vazão observada nessa carga e não a capacidade máxima de cada cenário; apenas três execuções por cenário, o que limita o poder estatístico; diferença de compilação do PHP (</w:t>
       </w:r>
       <w:r>
         <w:rPr>
@@ -27606,7 +27639,7 @@
           <w:sz w:val="16"/>
           <w:szCs w:val="16"/>
         </w:rPr>
-        <w:t xml:space="preserve"># Testes disponíveis:   smoke | load</w:t>
+        <w:t xml:space="preserve"># Testes disponíveis:   smoke | load | long | rate (taxa de chegada fixa; ver k6/rate.js)</w:t>
       </w:r>
     </w:p>
     <w:p>
@@ -27942,21 +27975,21 @@
           <w:sz w:val="16"/>
           <w:szCs w:val="16"/>
         </w:rPr>
-        <w:t xml:space="preserve">if [[ ! "$TEST" =~ ^(smoke|load|long)$ ]]; then</w:t>
-      </w:r>
-    </w:p>
-    <w:p>
-      <w:pPr>
-        <w:spacing w:line="240"/>
-        <w:jc w:val="left"/>
-      </w:pPr>
-      <w:r>
-        <w:rPr>
-          <w:rFonts w:ascii="Courier New" w:cs="Courier New" w:eastAsia="Courier New" w:hAnsi="Courier New"/>
-          <w:sz w:val="16"/>
-          <w:szCs w:val="16"/>
-        </w:rPr>
-        <w:t xml:space="preserve">  echo "Erro: teste inválido '$TEST'. Use: smoke, load ou long"</w:t>
+        <w:t xml:space="preserve">if [[ ! "$TEST" =~ ^(smoke|load|long|rate)$ ]]; then</w:t>
+      </w:r>
+    </w:p>
+    <w:p>
+      <w:pPr>
+        <w:spacing w:line="240"/>
+        <w:jc w:val="left"/>
+      </w:pPr>
+      <w:r>
+        <w:rPr>
+          <w:rFonts w:ascii="Courier New" w:cs="Courier New" w:eastAsia="Courier New" w:hAnsi="Courier New"/>
+          <w:sz w:val="16"/>
+          <w:szCs w:val="16"/>
+        </w:rPr>
+        <w:t xml:space="preserve">  echo "Erro: teste inválido '$TEST'. Use: smoke, load, long ou rate"</w:t>
       </w:r>
     </w:p>
     <w:p>
@@ -29791,6 +29824,48 @@
           <w:szCs w:val="16"/>
         </w:rPr>
         <w:t xml:space="preserve">  -e PLATEAU_S="${PLATEAU_S:-600}" \</w:t>
+      </w:r>
+    </w:p>
+    <w:p>
+      <w:pPr>
+        <w:spacing w:line="240"/>
+        <w:jc w:val="left"/>
+      </w:pPr>
+      <w:r>
+        <w:rPr>
+          <w:rFonts w:ascii="Courier New" w:cs="Courier New" w:eastAsia="Courier New" w:hAnsi="Courier New"/>
+          <w:sz w:val="16"/>
+          <w:szCs w:val="16"/>
+        </w:rPr>
+        <w:t xml:space="preserve">  -e RATE="${RATE:-100}" \</w:t>
+      </w:r>
+    </w:p>
+    <w:p>
+      <w:pPr>
+        <w:spacing w:line="240"/>
+        <w:jc w:val="left"/>
+      </w:pPr>
+      <w:r>
+        <w:rPr>
+          <w:rFonts w:ascii="Courier New" w:cs="Courier New" w:eastAsia="Courier New" w:hAnsi="Courier New"/>
+          <w:sz w:val="16"/>
+          <w:szCs w:val="16"/>
+        </w:rPr>
+        <w:t xml:space="preserve">  -e WARMUP_S="${WARMUP_S:-120}" \</w:t>
+      </w:r>
+    </w:p>
+    <w:p>
+      <w:pPr>
+        <w:spacing w:line="240"/>
+        <w:jc w:val="left"/>
+      </w:pPr>
+      <w:r>
+        <w:rPr>
+          <w:rFonts w:ascii="Courier New" w:cs="Courier New" w:eastAsia="Courier New" w:hAnsi="Courier New"/>
+          <w:sz w:val="16"/>
+          <w:szCs w:val="16"/>
+        </w:rPr>
+        <w:t xml:space="preserve">  -e RAMP_S="${RAMP_S:-120}" \</w:t>
       </w:r>
     </w:p>
     <w:p>
@@ -31145,6 +31220,20 @@
           <w:sz w:val="16"/>
           <w:szCs w:val="16"/>
         </w:rPr>
+        <w:t xml:space="preserve">PLATEAU_S = 600  # duração do patamar (s) nas execuções de 15 min</w:t>
+      </w:r>
+    </w:p>
+    <w:p>
+      <w:pPr>
+        <w:spacing w:line="240"/>
+        <w:jc w:val="left"/>
+      </w:pPr>
+      <w:r>
+        <w:rPr>
+          <w:rFonts w:ascii="Courier New" w:cs="Courier New" w:eastAsia="Courier New" w:hAnsi="Courier New"/>
+          <w:sz w:val="16"/>
+          <w:szCs w:val="16"/>
+        </w:rPr>
         <w:t xml:space="preserve">ENDPOINTS = ["health", "compute", "memory", "db"]</w:t>
       </w:r>
     </w:p>
@@ -31271,6 +31360,34 @@
           <w:sz w:val="16"/>
           <w:szCs w:val="16"/>
         </w:rPr>
+        <w:t xml:space="preserve">        sf = "{phase:plateau}"  # patamar de 10 min (aquecimento, rampa e descida excluídos)</w:t>
+      </w:r>
+    </w:p>
+    <w:p>
+      <w:pPr>
+        <w:spacing w:line="240"/>
+        <w:jc w:val="left"/>
+      </w:pPr>
+      <w:r>
+        <w:rPr>
+          <w:rFonts w:ascii="Courier New" w:cs="Courier New" w:eastAsia="Courier New" w:hAnsi="Courier New"/>
+          <w:sz w:val="16"/>
+          <w:szCs w:val="16"/>
+        </w:rPr>
+        <w:t xml:space="preserve">        dur = m[f"http_req_duration{sf}"]</w:t>
+      </w:r>
+    </w:p>
+    <w:p>
+      <w:pPr>
+        <w:spacing w:line="240"/>
+        <w:jc w:val="left"/>
+      </w:pPr>
+      <w:r>
+        <w:rPr>
+          <w:rFonts w:ascii="Courier New" w:cs="Courier New" w:eastAsia="Courier New" w:hAnsi="Courier New"/>
+          <w:sz w:val="16"/>
+          <w:szCs w:val="16"/>
+        </w:rPr>
         <w:t xml:space="preserve">        run = {</w:t>
       </w:r>
     </w:p>
@@ -31285,91 +31402,91 @@
           <w:sz w:val="16"/>
           <w:szCs w:val="16"/>
         </w:rPr>
-        <w:t xml:space="preserve">            "rps": m["http_reqs"]["rate"],</w:t>
-      </w:r>
-    </w:p>
-    <w:p>
-      <w:pPr>
-        <w:spacing w:line="240"/>
-        <w:jc w:val="left"/>
-      </w:pPr>
-      <w:r>
-        <w:rPr>
-          <w:rFonts w:ascii="Courier New" w:cs="Courier New" w:eastAsia="Courier New" w:hAnsi="Courier New"/>
-          <w:sz w:val="16"/>
-          <w:szCs w:val="16"/>
-        </w:rPr>
-        <w:t xml:space="preserve">            "reqs": m["http_reqs"]["count"],</w:t>
-      </w:r>
-    </w:p>
-    <w:p>
-      <w:pPr>
-        <w:spacing w:line="240"/>
-        <w:jc w:val="left"/>
-      </w:pPr>
-      <w:r>
-        <w:rPr>
-          <w:rFonts w:ascii="Courier New" w:cs="Courier New" w:eastAsia="Courier New" w:hAnsi="Courier New"/>
-          <w:sz w:val="16"/>
-          <w:szCs w:val="16"/>
-        </w:rPr>
-        <w:t xml:space="preserve">            "err": m["http_req_failed"].get("value", m["http_req_failed"].get("rate", 0)),</w:t>
-      </w:r>
-    </w:p>
-    <w:p>
-      <w:pPr>
-        <w:spacing w:line="240"/>
-        <w:jc w:val="left"/>
-      </w:pPr>
-      <w:r>
-        <w:rPr>
-          <w:rFonts w:ascii="Courier New" w:cs="Courier New" w:eastAsia="Courier New" w:hAnsi="Courier New"/>
-          <w:sz w:val="16"/>
-          <w:szCs w:val="16"/>
-        </w:rPr>
-        <w:t xml:space="preserve">            "avg": m["http_req_duration"]["avg"],</w:t>
-      </w:r>
-    </w:p>
-    <w:p>
-      <w:pPr>
-        <w:spacing w:line="240"/>
-        <w:jc w:val="left"/>
-      </w:pPr>
-      <w:r>
-        <w:rPr>
-          <w:rFonts w:ascii="Courier New" w:cs="Courier New" w:eastAsia="Courier New" w:hAnsi="Courier New"/>
-          <w:sz w:val="16"/>
-          <w:szCs w:val="16"/>
-        </w:rPr>
-        <w:t xml:space="preserve">            "p50": m["http_req_duration"]["med"],</w:t>
-      </w:r>
-    </w:p>
-    <w:p>
-      <w:pPr>
-        <w:spacing w:line="240"/>
-        <w:jc w:val="left"/>
-      </w:pPr>
-      <w:r>
-        <w:rPr>
-          <w:rFonts w:ascii="Courier New" w:cs="Courier New" w:eastAsia="Courier New" w:hAnsi="Courier New"/>
-          <w:sz w:val="16"/>
-          <w:szCs w:val="16"/>
-        </w:rPr>
-        <w:t xml:space="preserve">            "p95": m["http_req_duration"]["p(95)"],</w:t>
-      </w:r>
-    </w:p>
-    <w:p>
-      <w:pPr>
-        <w:spacing w:line="240"/>
-        <w:jc w:val="left"/>
-      </w:pPr>
-      <w:r>
-        <w:rPr>
-          <w:rFonts w:ascii="Courier New" w:cs="Courier New" w:eastAsia="Courier New" w:hAnsi="Courier New"/>
-          <w:sz w:val="16"/>
-          <w:szCs w:val="16"/>
-        </w:rPr>
-        <w:t xml:space="preserve">            "p99": m["http_req_duration"].get("p(99)", float("nan")),</w:t>
+        <w:t xml:space="preserve">            "rps": m[f"http_reqs{sf}"]["count"] / PLATEAU_S,   # o campo `rate` da submétrica divide pela duração total</w:t>
+      </w:r>
+    </w:p>
+    <w:p>
+      <w:pPr>
+        <w:spacing w:line="240"/>
+        <w:jc w:val="left"/>
+      </w:pPr>
+      <w:r>
+        <w:rPr>
+          <w:rFonts w:ascii="Courier New" w:cs="Courier New" w:eastAsia="Courier New" w:hAnsi="Courier New"/>
+          <w:sz w:val="16"/>
+          <w:szCs w:val="16"/>
+        </w:rPr>
+        <w:t xml:space="preserve">            "reqs": m[f"http_reqs{sf}"]["count"],</w:t>
+      </w:r>
+    </w:p>
+    <w:p>
+      <w:pPr>
+        <w:spacing w:line="240"/>
+        <w:jc w:val="left"/>
+      </w:pPr>
+      <w:r>
+        <w:rPr>
+          <w:rFonts w:ascii="Courier New" w:cs="Courier New" w:eastAsia="Courier New" w:hAnsi="Courier New"/>
+          <w:sz w:val="16"/>
+          <w:szCs w:val="16"/>
+        </w:rPr>
+        <w:t xml:space="preserve">            "err": m[f"http_req_failed{sf}"].get("value", m[f"http_req_failed{sf}"].get("rate", 0)),</w:t>
+      </w:r>
+    </w:p>
+    <w:p>
+      <w:pPr>
+        <w:spacing w:line="240"/>
+        <w:jc w:val="left"/>
+      </w:pPr>
+      <w:r>
+        <w:rPr>
+          <w:rFonts w:ascii="Courier New" w:cs="Courier New" w:eastAsia="Courier New" w:hAnsi="Courier New"/>
+          <w:sz w:val="16"/>
+          <w:szCs w:val="16"/>
+        </w:rPr>
+        <w:t xml:space="preserve">            "avg": dur["avg"],</w:t>
+      </w:r>
+    </w:p>
+    <w:p>
+      <w:pPr>
+        <w:spacing w:line="240"/>
+        <w:jc w:val="left"/>
+      </w:pPr>
+      <w:r>
+        <w:rPr>
+          <w:rFonts w:ascii="Courier New" w:cs="Courier New" w:eastAsia="Courier New" w:hAnsi="Courier New"/>
+          <w:sz w:val="16"/>
+          <w:szCs w:val="16"/>
+        </w:rPr>
+        <w:t xml:space="preserve">            "p50": dur["med"],</w:t>
+      </w:r>
+    </w:p>
+    <w:p>
+      <w:pPr>
+        <w:spacing w:line="240"/>
+        <w:jc w:val="left"/>
+      </w:pPr>
+      <w:r>
+        <w:rPr>
+          <w:rFonts w:ascii="Courier New" w:cs="Courier New" w:eastAsia="Courier New" w:hAnsi="Courier New"/>
+          <w:sz w:val="16"/>
+          <w:szCs w:val="16"/>
+        </w:rPr>
+        <w:t xml:space="preserve">            "p95": dur["p(95)"],</w:t>
+      </w:r>
+    </w:p>
+    <w:p>
+      <w:pPr>
+        <w:spacing w:line="240"/>
+        <w:jc w:val="left"/>
+      </w:pPr>
+      <w:r>
+        <w:rPr>
+          <w:rFonts w:ascii="Courier New" w:cs="Courier New" w:eastAsia="Courier New" w:hAnsi="Courier New"/>
+          <w:sz w:val="16"/>
+          <w:szCs w:val="16"/>
+        </w:rPr>
+        <w:t xml:space="preserve">            "p99": dur.get("p(99)", float("nan")),</w:t>
       </w:r>
     </w:p>
     <w:p>
@@ -31411,7 +31528,7 @@
           <w:sz w:val="16"/>
           <w:szCs w:val="16"/>
         </w:rPr>
-        <w:t xml:space="preserve">            k = f"endpoint_{e}_duration"</w:t>
+        <w:t xml:space="preserve">            k = f"endpoint_{e}_duration{sf}"</w:t>
       </w:r>
     </w:p>
     <w:p>
@@ -32615,21 +32732,35 @@
           <w:sz w:val="16"/>
           <w:szCs w:val="16"/>
         </w:rPr>
-        <w:t xml:space="preserve">        out.append(f"| {NOMES[s]} | {m['http_reqs']['rate']:.1f} | {m['http_req_duration']['p(95)']:.1f} | "</w:t>
-      </w:r>
-    </w:p>
-    <w:p>
-      <w:pPr>
-        <w:spacing w:line="240"/>
-        <w:jc w:val="left"/>
-      </w:pPr>
-      <w:r>
-        <w:rPr>
-          <w:rFonts w:ascii="Courier New" w:cs="Courier New" w:eastAsia="Courier New" w:hAnsi="Courier New"/>
-          <w:sz w:val="16"/>
-          <w:szCs w:val="16"/>
-        </w:rPr>
-        <w:t xml:space="preserve">                   f"{m['http_req_duration']['p(99)']:.1f} | {st.mean(prim):.1f} | {st.mean(ult):.1f} | {max(p[1] for p in pts):.1f} |")</w:t>
+        <w:t xml:space="preserve">        sf = "{phase:plateau}"  # patamar de 30 min</w:t>
+      </w:r>
+    </w:p>
+    <w:p>
+      <w:pPr>
+        <w:spacing w:line="240"/>
+        <w:jc w:val="left"/>
+      </w:pPr>
+      <w:r>
+        <w:rPr>
+          <w:rFonts w:ascii="Courier New" w:cs="Courier New" w:eastAsia="Courier New" w:hAnsi="Courier New"/>
+          <w:sz w:val="16"/>
+          <w:szCs w:val="16"/>
+        </w:rPr>
+        <w:t xml:space="preserve">        out.append(f"| {NOMES[s]} | {m[f'http_reqs{sf}']['count'] / 1800:.1f} | {m[f'http_req_duration{sf}']['p(95)']:.1f} | "</w:t>
+      </w:r>
+    </w:p>
+    <w:p>
+      <w:pPr>
+        <w:spacing w:line="240"/>
+        <w:jc w:val="left"/>
+      </w:pPr>
+      <w:r>
+        <w:rPr>
+          <w:rFonts w:ascii="Courier New" w:cs="Courier New" w:eastAsia="Courier New" w:hAnsi="Courier New"/>
+          <w:sz w:val="16"/>
+          <w:szCs w:val="16"/>
+        </w:rPr>
+        <w:t xml:space="preserve">                   f"{m[f'http_req_duration{sf}']['p(99)']:.1f} | {st.mean(prim):.1f} | {st.mean(ult):.1f} | {max(p[1] for p in pts):.1f} |")</w:t>
       </w:r>
     </w:p>
     <w:p>

</xml_diff>

<commit_message>
docs: Adiciona Dhaniswara et al. (2025) como referência e explica o número padrão de threads do cenário E
- Nova referência (ICITCOM 2025) usada na introdução, fundamentação (2.1 a 2.4), metodologia, discussão (comparação com o estudo mais próximo), limitações e considerações finais
- Cenário E: explica o padrão do FrankenPHP (2 vezes os núcleos de CPU visíveis) e registra que, com o limite de 1,0 CPU, resultou em 2 threads (contra 4 no B), medido no log de inicialização; hipótese sobre o maior desempenho com menos threads
- Rótulo das tabelas passa a "2 threads, padrão"; comentário do Caddyfile.default corrigido
- DOCX, PDF e .zip do Overleaf regenerados

Co-Authored-By: Claude Sonnet 5.5 <noreply@anthropic.com>
</commit_message>
<xml_diff>
--- a/TRABALHO DE CONCLUSÃO DE CURSO (TCC)/Orientação – Desenvolvimento e Conclusão da Pesquisa/Desenvolvimento e Conclusão do TCC - André Pereira.docx
+++ b/TRABALHO DE CONCLUSÃO DE CURSO (TCC)/Orientação – Desenvolvimento e Conclusão da Pesquisa/Desenvolvimento e Conclusão do TCC - André Pereira.docx
@@ -975,7 +975,7 @@
           <w:sz w:val="24"/>
           <w:szCs w:val="24"/>
         </w:rPr>
-        <w:t xml:space="preserve">	19</w:t>
+        <w:t xml:space="preserve">	20</w:t>
       </w:r>
     </w:p>
     <w:p>
@@ -1003,7 +1003,7 @@
           <w:sz w:val="24"/>
           <w:szCs w:val="24"/>
         </w:rPr>
-        <w:t xml:space="preserve">	20</w:t>
+        <w:t xml:space="preserve">	22</w:t>
       </w:r>
     </w:p>
     <w:p>
@@ -1031,7 +1031,7 @@
           <w:sz w:val="24"/>
           <w:szCs w:val="24"/>
         </w:rPr>
-        <w:t xml:space="preserve">	22</w:t>
+        <w:t xml:space="preserve">	23</w:t>
       </w:r>
     </w:p>
     <w:p>
@@ -1059,7 +1059,7 @@
           <w:sz w:val="24"/>
           <w:szCs w:val="24"/>
         </w:rPr>
-        <w:t xml:space="preserve">	23</w:t>
+        <w:t xml:space="preserve">	25</w:t>
       </w:r>
     </w:p>
     <w:p>
@@ -1087,7 +1087,7 @@
           <w:sz w:val="24"/>
           <w:szCs w:val="24"/>
         </w:rPr>
-        <w:t xml:space="preserve">	24</w:t>
+        <w:t xml:space="preserve">	26</w:t>
       </w:r>
     </w:p>
     <w:p>
@@ -1115,7 +1115,7 @@
           <w:sz w:val="24"/>
           <w:szCs w:val="24"/>
         </w:rPr>
-        <w:t xml:space="preserve">	25</w:t>
+        <w:t xml:space="preserve">	27</w:t>
       </w:r>
     </w:p>
     <w:p>
@@ -1143,7 +1143,7 @@
           <w:sz w:val="24"/>
           <w:szCs w:val="24"/>
         </w:rPr>
-        <w:t xml:space="preserve">	26</w:t>
+        <w:t xml:space="preserve">	28</w:t>
       </w:r>
     </w:p>
     <w:p>
@@ -1171,7 +1171,7 @@
           <w:sz w:val="24"/>
           <w:szCs w:val="24"/>
         </w:rPr>
-        <w:t xml:space="preserve">	27</w:t>
+        <w:t xml:space="preserve">	29</w:t>
       </w:r>
     </w:p>
     <w:p>
@@ -1199,7 +1199,7 @@
           <w:sz w:val="24"/>
           <w:szCs w:val="24"/>
         </w:rPr>
-        <w:t xml:space="preserve">	28</w:t>
+        <w:t xml:space="preserve">	30</w:t>
       </w:r>
     </w:p>
     <w:p>
@@ -1227,7 +1227,7 @@
           <w:sz w:val="24"/>
           <w:szCs w:val="24"/>
         </w:rPr>
-        <w:t xml:space="preserve">	29</w:t>
+        <w:t xml:space="preserve">	31</w:t>
       </w:r>
     </w:p>
     <w:p>
@@ -1255,7 +1255,7 @@
           <w:sz w:val="24"/>
           <w:szCs w:val="24"/>
         </w:rPr>
-        <w:t xml:space="preserve">	30</w:t>
+        <w:t xml:space="preserve">	32</w:t>
       </w:r>
     </w:p>
     <w:p>
@@ -1283,7 +1283,7 @@
           <w:sz w:val="24"/>
           <w:szCs w:val="24"/>
         </w:rPr>
-        <w:t xml:space="preserve">	31</w:t>
+        <w:t xml:space="preserve">	33</w:t>
       </w:r>
     </w:p>
     <w:p>
@@ -1311,7 +1311,7 @@
           <w:sz w:val="24"/>
           <w:szCs w:val="24"/>
         </w:rPr>
-        <w:t xml:space="preserve">	32</w:t>
+        <w:t xml:space="preserve">	34</w:t>
       </w:r>
     </w:p>
     <w:p>
@@ -1356,7 +1356,7 @@
           <w:sz w:val="24"/>
           <w:szCs w:val="24"/>
         </w:rPr>
-        <w:t xml:space="preserve">	20</w:t>
+        <w:t xml:space="preserve">	21</w:t>
       </w:r>
     </w:p>
     <w:p>
@@ -1384,7 +1384,7 @@
           <w:sz w:val="24"/>
           <w:szCs w:val="24"/>
         </w:rPr>
-        <w:t xml:space="preserve">	21</w:t>
+        <w:t xml:space="preserve">	23</w:t>
       </w:r>
     </w:p>
     <w:p>
@@ -1412,7 +1412,7 @@
           <w:sz w:val="24"/>
           <w:szCs w:val="24"/>
         </w:rPr>
-        <w:t xml:space="preserve">	22</w:t>
+        <w:t xml:space="preserve">	23</w:t>
       </w:r>
     </w:p>
     <w:p>
@@ -1440,7 +1440,7 @@
           <w:sz w:val="24"/>
           <w:szCs w:val="24"/>
         </w:rPr>
-        <w:t xml:space="preserve">	23</w:t>
+        <w:t xml:space="preserve">	24</w:t>
       </w:r>
     </w:p>
     <w:p>
@@ -1468,7 +1468,7 @@
           <w:sz w:val="24"/>
           <w:szCs w:val="24"/>
         </w:rPr>
-        <w:t xml:space="preserve">	24</w:t>
+        <w:t xml:space="preserve">	26</w:t>
       </w:r>
     </w:p>
     <w:p>
@@ -1496,7 +1496,7 @@
           <w:sz w:val="24"/>
           <w:szCs w:val="24"/>
         </w:rPr>
-        <w:t xml:space="preserve">	67</w:t>
+        <w:t xml:space="preserve">	69</w:t>
       </w:r>
     </w:p>
     <w:p>
@@ -1524,7 +1524,7 @@
           <w:sz w:val="24"/>
           <w:szCs w:val="24"/>
         </w:rPr>
-        <w:t xml:space="preserve">	67</w:t>
+        <w:t xml:space="preserve">	69</w:t>
       </w:r>
     </w:p>
     <w:p>
@@ -2106,7 +2106,7 @@
           <w:sz w:val="24"/>
           <w:szCs w:val="24"/>
         </w:rPr>
-        <w:t xml:space="preserve">	14</w:t>
+        <w:t xml:space="preserve">	15</w:t>
       </w:r>
     </w:p>
     <w:p>
@@ -2162,7 +2162,7 @@
           <w:sz w:val="24"/>
           <w:szCs w:val="24"/>
         </w:rPr>
-        <w:t xml:space="preserve">	15</w:t>
+        <w:t xml:space="preserve">	16</w:t>
       </w:r>
     </w:p>
     <w:p>
@@ -2190,7 +2190,7 @@
           <w:sz w:val="24"/>
           <w:szCs w:val="24"/>
         </w:rPr>
-        <w:t xml:space="preserve">	16</w:t>
+        <w:t xml:space="preserve">	17</w:t>
       </w:r>
     </w:p>
     <w:p>
@@ -2218,7 +2218,7 @@
           <w:sz w:val="24"/>
           <w:szCs w:val="24"/>
         </w:rPr>
-        <w:t xml:space="preserve">	16</w:t>
+        <w:t xml:space="preserve">	17</w:t>
       </w:r>
     </w:p>
     <w:p>
@@ -2246,7 +2246,7 @@
           <w:sz w:val="24"/>
           <w:szCs w:val="24"/>
         </w:rPr>
-        <w:t xml:space="preserve">	17</w:t>
+        <w:t xml:space="preserve">	18</w:t>
       </w:r>
     </w:p>
     <w:p>
@@ -2274,7 +2274,7 @@
           <w:sz w:val="24"/>
           <w:szCs w:val="24"/>
         </w:rPr>
-        <w:t xml:space="preserve">	17</w:t>
+        <w:t xml:space="preserve">	18</w:t>
       </w:r>
     </w:p>
     <w:p>
@@ -2302,7 +2302,7 @@
           <w:sz w:val="24"/>
           <w:szCs w:val="24"/>
         </w:rPr>
-        <w:t xml:space="preserve">	17</w:t>
+        <w:t xml:space="preserve">	19</w:t>
       </w:r>
     </w:p>
     <w:p>
@@ -2330,7 +2330,7 @@
           <w:sz w:val="24"/>
           <w:szCs w:val="24"/>
         </w:rPr>
-        <w:t xml:space="preserve">	18</w:t>
+        <w:t xml:space="preserve">	19</w:t>
       </w:r>
     </w:p>
     <w:p>
@@ -2358,7 +2358,7 @@
           <w:sz w:val="24"/>
           <w:szCs w:val="24"/>
         </w:rPr>
-        <w:t xml:space="preserve">	19</w:t>
+        <w:t xml:space="preserve">	20</w:t>
       </w:r>
     </w:p>
     <w:p>
@@ -2386,7 +2386,7 @@
           <w:sz w:val="24"/>
           <w:szCs w:val="24"/>
         </w:rPr>
-        <w:t xml:space="preserve">	19</w:t>
+        <w:t xml:space="preserve">	20</w:t>
       </w:r>
     </w:p>
     <w:p>
@@ -2414,7 +2414,7 @@
           <w:sz w:val="24"/>
           <w:szCs w:val="24"/>
         </w:rPr>
-        <w:t xml:space="preserve">	20</w:t>
+        <w:t xml:space="preserve">	21</w:t>
       </w:r>
     </w:p>
     <w:p>
@@ -2442,7 +2442,7 @@
           <w:sz w:val="24"/>
           <w:szCs w:val="24"/>
         </w:rPr>
-        <w:t xml:space="preserve">	21</w:t>
+        <w:t xml:space="preserve">	23</w:t>
       </w:r>
     </w:p>
     <w:p>
@@ -2470,7 +2470,7 @@
           <w:sz w:val="24"/>
           <w:szCs w:val="24"/>
         </w:rPr>
-        <w:t xml:space="preserve">	23</w:t>
+        <w:t xml:space="preserve">	24</w:t>
       </w:r>
     </w:p>
     <w:p>
@@ -2498,7 +2498,7 @@
           <w:sz w:val="24"/>
           <w:szCs w:val="24"/>
         </w:rPr>
-        <w:t xml:space="preserve">	24</w:t>
+        <w:t xml:space="preserve">	25</w:t>
       </w:r>
     </w:p>
     <w:p>
@@ -2526,7 +2526,7 @@
           <w:sz w:val="24"/>
           <w:szCs w:val="24"/>
         </w:rPr>
-        <w:t xml:space="preserve">	25</w:t>
+        <w:t xml:space="preserve">	26</w:t>
       </w:r>
     </w:p>
     <w:p>
@@ -2554,7 +2554,7 @@
           <w:sz w:val="24"/>
           <w:szCs w:val="24"/>
         </w:rPr>
-        <w:t xml:space="preserve">	32</w:t>
+        <w:t xml:space="preserve">	34</w:t>
       </w:r>
     </w:p>
     <w:p>
@@ -2582,7 +2582,7 @@
           <w:sz w:val="24"/>
           <w:szCs w:val="24"/>
         </w:rPr>
-        <w:t xml:space="preserve">	34</w:t>
+        <w:t xml:space="preserve">	37</w:t>
       </w:r>
     </w:p>
     <w:p>
@@ -2610,7 +2610,7 @@
           <w:sz w:val="24"/>
           <w:szCs w:val="24"/>
         </w:rPr>
-        <w:t xml:space="preserve">	36</w:t>
+        <w:t xml:space="preserve">	38</w:t>
       </w:r>
     </w:p>
     <w:p>
@@ -2638,7 +2638,7 @@
           <w:sz w:val="24"/>
           <w:szCs w:val="24"/>
         </w:rPr>
-        <w:t xml:space="preserve">	39</w:t>
+        <w:t xml:space="preserve">	41</w:t>
       </w:r>
     </w:p>
     <w:p>
@@ -2666,7 +2666,7 @@
           <w:sz w:val="24"/>
           <w:szCs w:val="24"/>
         </w:rPr>
-        <w:t xml:space="preserve">	40</w:t>
+        <w:t xml:space="preserve">	42</w:t>
       </w:r>
     </w:p>
     <w:p>
@@ -2694,7 +2694,7 @@
           <w:sz w:val="24"/>
           <w:szCs w:val="24"/>
         </w:rPr>
-        <w:t xml:space="preserve">	45</w:t>
+        <w:t xml:space="preserve">	47</w:t>
       </w:r>
     </w:p>
     <w:p>
@@ -2722,7 +2722,7 @@
           <w:sz w:val="24"/>
           <w:szCs w:val="24"/>
         </w:rPr>
-        <w:t xml:space="preserve">	50</w:t>
+        <w:t xml:space="preserve">	52</w:t>
       </w:r>
     </w:p>
     <w:p>
@@ -2750,7 +2750,7 @@
           <w:sz w:val="24"/>
           <w:szCs w:val="24"/>
         </w:rPr>
-        <w:t xml:space="preserve">	54</w:t>
+        <w:t xml:space="preserve">	56</w:t>
       </w:r>
     </w:p>
     <w:p>
@@ -2778,7 +2778,7 @@
           <w:sz w:val="24"/>
           <w:szCs w:val="24"/>
         </w:rPr>
-        <w:t xml:space="preserve">	64</w:t>
+        <w:t xml:space="preserve">	66</w:t>
       </w:r>
     </w:p>
     <w:p>
@@ -2806,7 +2806,7 @@
           <w:sz w:val="24"/>
           <w:szCs w:val="24"/>
         </w:rPr>
-        <w:t xml:space="preserve">	67</w:t>
+        <w:t xml:space="preserve">	69</w:t>
       </w:r>
     </w:p>
     <w:p>
@@ -2840,7 +2840,7 @@
           <w:sz w:val="24"/>
           <w:szCs w:val="24"/>
         </w:rPr>
-        <w:t xml:space="preserve">	68</w:t>
+        <w:t xml:space="preserve">	70</w:t>
       </w:r>
     </w:p>
     <w:p>
@@ -3016,7 +3016,25 @@
           <w:sz w:val="24"/>
           <w:szCs w:val="24"/>
         </w:rPr>
-        <w:t xml:space="preserve"> reside na necessidade de validar a transição desse modelo tradicional para o paradigma de memória persistente por meio de servidores de aplicação modernos. O surgimento de tecnologias como o Swoole e o FrankenPHP permitiu que o PHP funcionasse com laços de eventos persistentes, mantendo a aplicação carregada na memória RAM e reduzindo a inicialização. O ecossistema Laravel, por meio do Laravel Octane, já consolidou essa prática como padrão de mercado para alto desempenho, tratando nativamente a limpeza de estado e a injeção de dependências.</w:t>
+        <w:t xml:space="preserve"> reside na necessidade de validar a transição desse modelo tradicional para o paradigma de memória persistente por meio de servidores de aplicação modernos. O surgimento de tecnologias como o Swoole e o FrankenPHP permitiu que o PHP funcionasse com laços de eventos persistentes, mantendo a aplicação carregada na memória RAM e reduzindo a inicialização. O ecossistema Laravel, por meio do Laravel Octane, já consolidou essa prática como padrão de mercado para alto desempenho, tratando nativamente a limpeza de estado e a injeção de dependências. Ainda assim, estudos que comparam a arquitetura tradicional (PHP-FPM com servidor web separado) com a integrada (FrankenPHP) são escassos: a literatura concentra-se na otimização no nível da aplicação ou do </w:t>
+      </w:r>
+      <w:r>
+        <w:rPr>
+          <w:rFonts w:ascii="Times New Roman" w:cs="Times New Roman" w:eastAsia="Times New Roman" w:hAnsi="Times New Roman"/>
+          <w:i/>
+          <w:iCs/>
+          <w:sz w:val="24"/>
+          <w:szCs w:val="24"/>
+        </w:rPr>
+        <w:t xml:space="preserve">framework</w:t>
+      </w:r>
+      <w:r>
+        <w:rPr>
+          <w:rFonts w:ascii="Times New Roman" w:cs="Times New Roman" w:eastAsia="Times New Roman" w:hAnsi="Times New Roman"/>
+          <w:sz w:val="24"/>
+          <w:szCs w:val="24"/>
+        </w:rPr>
+        <w:t xml:space="preserve">, e os estudos sobre a camada do servidor de aplicação são limitados (DHANISWARA; KUSUMASARI; ALAM, 2025).</w:t>
       </w:r>
     </w:p>
     <w:p>
@@ -3438,6 +3456,39 @@
     </w:p>
     <w:p>
       <w:pPr>
+        <w:spacing w:after="0" w:before="0" w:line="360" w:lineRule="auto"/>
+        <w:ind w:firstLine="709"/>
+        <w:jc w:val="both"/>
+      </w:pPr>
+      <w:r>
+        <w:rPr>
+          <w:rFonts w:ascii="Times New Roman" w:cs="Times New Roman" w:eastAsia="Times New Roman" w:hAnsi="Times New Roman"/>
+          <w:sz w:val="24"/>
+          <w:szCs w:val="24"/>
+        </w:rPr>
+        <w:t xml:space="preserve">Dhaniswara, Kusumasari e Alam (2025) detalham a origem desse custo na arquitetura usual de implantação, em que um servidor web (como o Nginx) atua como </w:t>
+      </w:r>
+      <w:r>
+        <w:rPr>
+          <w:rFonts w:ascii="Times New Roman" w:cs="Times New Roman" w:eastAsia="Times New Roman" w:hAnsi="Times New Roman"/>
+          <w:i/>
+          <w:iCs/>
+          <w:sz w:val="24"/>
+          <w:szCs w:val="24"/>
+        </w:rPr>
+        <w:t xml:space="preserve">proxy</w:t>
+      </w:r>
+      <w:r>
+        <w:rPr>
+          <w:rFonts w:ascii="Times New Roman" w:cs="Times New Roman" w:eastAsia="Times New Roman" w:hAnsi="Times New Roman"/>
+          <w:sz w:val="24"/>
+          <w:szCs w:val="24"/>
+        </w:rPr>
+        <w:t xml:space="preserve"> reverso e encaminha as requisições ao PHP-FPM pelo protocolo FastCGI. A separação entre os dois processos dá flexibilidade e estabilidade, mas acrescenta uma comunicação entre processos a cada requisição, além da reinicialização da aplicação, o que, segundo os autores, limita o desempenho máximo, sobretudo em aplicações de grande porte.</w:t>
+      </w:r>
+    </w:p>
+    <w:p>
+      <w:pPr>
         <w:keepNext/>
         <w:spacing w:after="240" w:before="360" w:line="360"/>
         <w:jc w:val="left"/>
@@ -3519,7 +3570,41 @@
           <w:sz w:val="24"/>
           <w:szCs w:val="24"/>
         </w:rPr>
-        <w:t xml:space="preserve"> iniciadas na partida, comparável ao modo estático do PHP-FPM (DUNGLAS, 2024).</w:t>
+        <w:t xml:space="preserve"> iniciadas na partida, comparável ao modo estático do PHP-FPM (DUNGLAS, 2024). Por padrão, o servidor inicia o dobro de </w:t>
+      </w:r>
+      <w:r>
+        <w:rPr>
+          <w:rFonts w:ascii="Times New Roman" w:cs="Times New Roman" w:eastAsia="Times New Roman" w:hAnsi="Times New Roman"/>
+          <w:i/>
+          <w:iCs/>
+          <w:sz w:val="24"/>
+          <w:szCs w:val="24"/>
+        </w:rPr>
+        <w:t xml:space="preserve">threads</w:t>
+      </w:r>
+      <w:r>
+        <w:rPr>
+          <w:rFonts w:ascii="Times New Roman" w:cs="Times New Roman" w:eastAsia="Times New Roman" w:hAnsi="Times New Roman"/>
+          <w:sz w:val="24"/>
+          <w:szCs w:val="24"/>
+        </w:rPr>
+        <w:t xml:space="preserve"> em relação ao número de núcleos de CPU disponíveis, e a diretiva </w:t>
+      </w:r>
+      <w:r>
+        <w:rPr>
+          <w:rFonts w:ascii="Courier New" w:cs="Courier New" w:eastAsia="Courier New" w:hAnsi="Courier New"/>
+          <w:sz w:val="22"/>
+          <w:szCs w:val="22"/>
+        </w:rPr>
+        <w:t xml:space="preserve">num_threads</w:t>
+      </w:r>
+      <w:r>
+        <w:rPr>
+          <w:rFonts w:ascii="Times New Roman" w:cs="Times New Roman" w:eastAsia="Times New Roman" w:hAnsi="Times New Roman"/>
+          <w:sz w:val="24"/>
+          <w:szCs w:val="24"/>
+        </w:rPr>
+        <w:t xml:space="preserve"> permite fixar outro valor (DUNGLAS, 2024).</w:t>
       </w:r>
     </w:p>
     <w:p>
@@ -3607,6 +3692,39 @@
           <w:szCs w:val="24"/>
         </w:rPr>
         <w:t xml:space="preserve">, e cada requisição executa apenas o tratamento do pedido (DUNGLAS, 2024). A contrapartida é que o programador passa a ser responsável por não vazar estado de uma requisição para outra, já que objetos e variáveis estáticas podem sobreviver entre elas.</w:t>
+      </w:r>
+    </w:p>
+    <w:p>
+      <w:pPr>
+        <w:spacing w:after="0" w:before="0" w:line="360" w:lineRule="auto"/>
+        <w:ind w:firstLine="709"/>
+        <w:jc w:val="both"/>
+      </w:pPr>
+      <w:r>
+        <w:rPr>
+          <w:rFonts w:ascii="Times New Roman" w:cs="Times New Roman" w:eastAsia="Times New Roman" w:hAnsi="Times New Roman"/>
+          <w:sz w:val="24"/>
+          <w:szCs w:val="24"/>
+        </w:rPr>
+        <w:t xml:space="preserve">Dhaniswara, Kusumasari e Alam (2025) descrevem essa abordagem como um modelo integrado, em que as funções do servidor web e do interpretador PHP são reunidas em um único processo, o que elimina a comunicação entre processos do modelo tradicional, com o risco de falha centralizada. No modo Worker, o </w:t>
+      </w:r>
+      <w:r>
+        <w:rPr>
+          <w:rFonts w:ascii="Times New Roman" w:cs="Times New Roman" w:eastAsia="Times New Roman" w:hAnsi="Times New Roman"/>
+          <w:i/>
+          <w:iCs/>
+          <w:sz w:val="24"/>
+          <w:szCs w:val="24"/>
+        </w:rPr>
+        <w:t xml:space="preserve">framework</w:t>
+      </w:r>
+      <w:r>
+        <w:rPr>
+          <w:rFonts w:ascii="Times New Roman" w:cs="Times New Roman" w:eastAsia="Times New Roman" w:hAnsi="Times New Roman"/>
+          <w:sz w:val="24"/>
+          <w:szCs w:val="24"/>
+        </w:rPr>
+        <w:t xml:space="preserve"> é inicializado uma vez e mantém seu estado em memória, em vez de recarregar todos os componentes a cada requisição. Os autores ressaltam que a comparação direta entre os modelos tradicional e integrado ainda é pouco estudada, pois o FrankenPHP e tecnologias semelhantes surgiram por volta de 2022 e 2023.</w:t>
       </w:r>
     </w:p>
     <w:p>
@@ -3730,7 +3848,7 @@
           <w:sz w:val="24"/>
           <w:szCs w:val="24"/>
         </w:rPr>
-        <w:t xml:space="preserve"> preserva ou reinicia entre requisições é verificado experimentalmente na Seção 4.1.</w:t>
+        <w:t xml:space="preserve"> preserva ou reinicia entre requisições é verificado experimentalmente na Seção 4.1. Quanto à implantação, Dhaniswara, Kusumasari e Alam (2025) executaram o Laravel Octane sobre o FrankenPHP em contêiner Docker, a partir da imagem oficial do FrankenPHP, o que dispensa um contêiner separado para o Nginx e reduz o número de componentes da implantação.</w:t>
       </w:r>
     </w:p>
     <w:p>
@@ -3787,6 +3905,75 @@
     </w:p>
     <w:p>
       <w:pPr>
+        <w:spacing w:after="0" w:before="0" w:line="360" w:lineRule="auto"/>
+        <w:ind w:firstLine="709"/>
+        <w:jc w:val="both"/>
+      </w:pPr>
+      <w:r>
+        <w:rPr>
+          <w:rFonts w:ascii="Times New Roman" w:cs="Times New Roman" w:eastAsia="Times New Roman" w:hAnsi="Times New Roman"/>
+          <w:sz w:val="24"/>
+          <w:szCs w:val="24"/>
+        </w:rPr>
+        <w:t xml:space="preserve">O estudo mais próximo deste trabalho é o de Dhaniswara, Kusumasari e Alam (2025), que compararam duas arquiteturas de implantação de uma aplicação Laravel 12 em contêineres Docker com limites idênticos de recursos: PHP-FPM com Nginx e FrankenPHP em modo Worker com Laravel Octane. Com o Apache JMeter (100 usuários virtuais por 10 minutos), mediram tempo de resposta, vazão e uso de CPU e memória. Em um </w:t>
+      </w:r>
+      <w:r>
+        <w:rPr>
+          <w:rFonts w:ascii="Times New Roman" w:cs="Times New Roman" w:eastAsia="Times New Roman" w:hAnsi="Times New Roman"/>
+          <w:i/>
+          <w:iCs/>
+          <w:sz w:val="24"/>
+          <w:szCs w:val="24"/>
+        </w:rPr>
+        <w:t xml:space="preserve">endpoint</w:t>
+      </w:r>
+      <w:r>
+        <w:rPr>
+          <w:rFonts w:ascii="Times New Roman" w:cs="Times New Roman" w:eastAsia="Times New Roman" w:hAnsi="Times New Roman"/>
+          <w:sz w:val="24"/>
+          <w:szCs w:val="24"/>
+        </w:rPr>
+        <w:t xml:space="preserve"> de carga leve por requisição, o FrankenPHP teve tempo de resposta médio cerca de 15,8% menor e vazão 18,6% maior, com percentis mais estáveis, ao custo de maior consumo de memória; em um </w:t>
+      </w:r>
+      <w:r>
+        <w:rPr>
+          <w:rFonts w:ascii="Times New Roman" w:cs="Times New Roman" w:eastAsia="Times New Roman" w:hAnsi="Times New Roman"/>
+          <w:i/>
+          <w:iCs/>
+          <w:sz w:val="24"/>
+          <w:szCs w:val="24"/>
+        </w:rPr>
+        <w:t xml:space="preserve">endpoint</w:t>
+      </w:r>
+      <w:r>
+        <w:rPr>
+          <w:rFonts w:ascii="Times New Roman" w:cs="Times New Roman" w:eastAsia="Times New Roman" w:hAnsi="Times New Roman"/>
+          <w:sz w:val="24"/>
+          <w:szCs w:val="24"/>
+        </w:rPr>
+        <w:t xml:space="preserve"> que serializa grande volume de dados, as duas arquiteturas atingiram o limite de CPU e tiveram desempenho semelhante, o que os autores atribuem à aplicação, e não ao servidor. Eles também apontam como lacuna a escassez de estudos quantitativos sobre a camada do servidor de aplicação, já que a literatura se concentra na otimização da aplicação ou do </w:t>
+      </w:r>
+      <w:r>
+        <w:rPr>
+          <w:rFonts w:ascii="Times New Roman" w:cs="Times New Roman" w:eastAsia="Times New Roman" w:hAnsi="Times New Roman"/>
+          <w:i/>
+          <w:iCs/>
+          <w:sz w:val="24"/>
+          <w:szCs w:val="24"/>
+        </w:rPr>
+        <w:t xml:space="preserve">framework</w:t>
+      </w:r>
+      <w:r>
+        <w:rPr>
+          <w:rFonts w:ascii="Times New Roman" w:cs="Times New Roman" w:eastAsia="Times New Roman" w:hAnsi="Times New Roman"/>
+          <w:sz w:val="24"/>
+          <w:szCs w:val="24"/>
+        </w:rPr>
+        <w:t xml:space="preserve">. Este trabalho contribui para essa lacuna no caso do CodeIgniter 4, com o modo clássico do FrankenPHP como cenário adicional e o k6 como ferramenta de carga.</w:t>
+      </w:r>
+    </w:p>
+    <w:p>
+      <w:pPr>
         <w:keepNext/>
         <w:spacing w:after="240" w:before="360" w:line="360"/>
         <w:jc w:val="left"/>
@@ -4280,7 +4467,23 @@
           <w:sz w:val="24"/>
           <w:szCs w:val="24"/>
         </w:rPr>
-        <w:t xml:space="preserve"> idêntico ao B, porém com o número padrão de </w:t>
+        <w:t xml:space="preserve"> idêntico ao B, porém sem a diretiva </w:t>
+      </w:r>
+      <w:r>
+        <w:rPr>
+          <w:rFonts w:ascii="Courier New" w:cs="Courier New" w:eastAsia="Courier New" w:hAnsi="Courier New"/>
+          <w:sz w:val="22"/>
+          <w:szCs w:val="22"/>
+        </w:rPr>
+        <w:t xml:space="preserve">num_threads</w:t>
+      </w:r>
+      <w:r>
+        <w:rPr>
+          <w:rFonts w:ascii="Times New Roman" w:cs="Times New Roman" w:eastAsia="Times New Roman" w:hAnsi="Times New Roman"/>
+          <w:sz w:val="24"/>
+          <w:szCs w:val="24"/>
+        </w:rPr>
+        <w:t xml:space="preserve">, de modo que o FrankenPHP usa o número padrão de </w:t>
       </w:r>
       <w:r>
         <w:rPr>
@@ -4298,7 +4501,25 @@
           <w:sz w:val="24"/>
           <w:szCs w:val="24"/>
         </w:rPr>
-        <w:t xml:space="preserve"> do FrankenPHP, sem a diretiva </w:t>
+        <w:t xml:space="preserve">, o dobro dos núcleos de CPU que ele enxerga. Com o limite de 1,0 CPU do contêiner, isso resultou em 2 </w:t>
+      </w:r>
+      <w:r>
+        <w:rPr>
+          <w:rFonts w:ascii="Times New Roman" w:cs="Times New Roman" w:eastAsia="Times New Roman" w:hAnsi="Times New Roman"/>
+          <w:i/>
+          <w:iCs/>
+          <w:sz w:val="24"/>
+          <w:szCs w:val="24"/>
+        </w:rPr>
+        <w:t xml:space="preserve">threads</w:t>
+      </w:r>
+      <w:r>
+        <w:rPr>
+          <w:rFonts w:ascii="Times New Roman" w:cs="Times New Roman" w:eastAsia="Times New Roman" w:hAnsi="Times New Roman"/>
+          <w:sz w:val="24"/>
+          <w:szCs w:val="24"/>
+        </w:rPr>
+        <w:t xml:space="preserve"> PHP (contra 4 no B), valor confirmado no registro de inicialização do servidor (</w:t>
       </w:r>
       <w:r>
         <w:rPr>
@@ -4306,15 +4527,51 @@
           <w:sz w:val="22"/>
           <w:szCs w:val="22"/>
         </w:rPr>
-        <w:t xml:space="preserve">num_threads</w:t>
-      </w:r>
-      <w:r>
-        <w:rPr>
-          <w:rFonts w:ascii="Times New Roman" w:cs="Times New Roman" w:eastAsia="Times New Roman" w:hAnsi="Times New Roman"/>
-          <w:sz w:val="24"/>
-          <w:szCs w:val="24"/>
-        </w:rPr>
-        <w:t xml:space="preserve">. Foi incluído para verificar se o resultado do modo clássico depende dessa configuração.</w:t>
+        <w:t xml:space="preserve">total_threads</w:t>
+      </w:r>
+      <w:r>
+        <w:rPr>
+          <w:rFonts w:ascii="Times New Roman" w:cs="Times New Roman" w:eastAsia="Times New Roman" w:hAnsi="Times New Roman"/>
+          <w:sz w:val="24"/>
+          <w:szCs w:val="24"/>
+        </w:rPr>
+        <w:t xml:space="preserve">: 2); sem o limite, o servidor iniciaria 32 </w:t>
+      </w:r>
+      <w:r>
+        <w:rPr>
+          <w:rFonts w:ascii="Times New Roman" w:cs="Times New Roman" w:eastAsia="Times New Roman" w:hAnsi="Times New Roman"/>
+          <w:i/>
+          <w:iCs/>
+          <w:sz w:val="24"/>
+          <w:szCs w:val="24"/>
+        </w:rPr>
+        <w:t xml:space="preserve">threads</w:t>
+      </w:r>
+      <w:r>
+        <w:rPr>
+          <w:rFonts w:ascii="Times New Roman" w:cs="Times New Roman" w:eastAsia="Times New Roman" w:hAnsi="Times New Roman"/>
+          <w:sz w:val="24"/>
+          <w:szCs w:val="24"/>
+        </w:rPr>
+        <w:t xml:space="preserve"> (2 × 16 </w:t>
+      </w:r>
+      <w:r>
+        <w:rPr>
+          <w:rFonts w:ascii="Times New Roman" w:cs="Times New Roman" w:eastAsia="Times New Roman" w:hAnsi="Times New Roman"/>
+          <w:i/>
+          <w:iCs/>
+          <w:sz w:val="24"/>
+          <w:szCs w:val="24"/>
+        </w:rPr>
+        <w:t xml:space="preserve">threads</w:t>
+      </w:r>
+      <w:r>
+        <w:rPr>
+          <w:rFonts w:ascii="Times New Roman" w:cs="Times New Roman" w:eastAsia="Times New Roman" w:hAnsi="Times New Roman"/>
+          <w:sz w:val="24"/>
+          <w:szCs w:val="24"/>
+        </w:rPr>
+        <w:t xml:space="preserve"> lógicas do hospedeiro). Foi incluído para verificar se o resultado do modo clássico depende dessa configuração.</w:t>
       </w:r>
     </w:p>
     <w:p>
@@ -4401,7 +4658,7 @@
           <w:sz w:val="24"/>
           <w:szCs w:val="24"/>
         </w:rPr>
-        <w:t xml:space="preserve">. Todos usam OPcache com a mesma configuração e o mesmo banco PostgreSQL 16 (contêiner separado, com 0,5 CPU e 256 MB, fora do orçamento dos cenários e idêntico em todos eles).</w:t>
+        <w:t xml:space="preserve">. Todos usam OPcache com a mesma configuração e o mesmo banco PostgreSQL 16 (contêiner separado, com 0,5 CPU e 256 MB, fora do orçamento dos cenários e idêntico em todos eles). Esse desenho, com limites idênticos de recursos por arquitetura, a mesma configuração de OPcache e o uso de contêineres Docker para obter condições consistentes e isoladas, segue o adotado por Dhaniswara, Kusumasari e Alam (2025) na comparação entre PHP-FPM com Nginx e FrankenPHP.</w:t>
       </w:r>
     </w:p>
     <w:p>
@@ -4613,7 +4870,7 @@
           <w:sz w:val="24"/>
           <w:szCs w:val="24"/>
         </w:rPr>
-        <w:t xml:space="preserve"> a cada poucos segundos, em paralelo ao teste. A vazão e a latência são calculadas apenas sobre o patamar de 10 minutos (aquecimento, rampa e descida excluídos), e a vazão é o número de requisições do patamar dividido por 600 s; a CPU e a RAM são médias da mesma janela. Como a carga usa um único nível de concorrência (100 usuários virtuais), a vazão medida é a observada nessa carga, e não necessariamente a capacidade máxima de cada cenário.</w:t>
+        <w:t xml:space="preserve"> a cada poucos segundos, em paralelo ao teste. A vazão e a latência são calculadas apenas sobre o patamar de 10 minutos (aquecimento, rampa e descida excluídos), e a vazão é o número de requisições do patamar dividido por 600 s; a CPU e a RAM são médias da mesma janela. Como a carga usa um único nível de concorrência (100 usuários virtuais), a vazão medida é a observada nessa carga, e não necessariamente a capacidade máxima de cada cenário. As métricas escolhidas (vazão, tempo de resposta e uso de CPU e memória) são as mesmas usadas por Dhaniswara, Kusumasari e Alam (2025) na avaliação de arquiteturas de implantação em contêineres, que também reportam percentis (p50, p90, p95 e p99) do tempo de resposta.</w:t>
       </w:r>
     </w:p>
     <w:p>
@@ -5895,7 +6152,57 @@
           <w:sz w:val="24"/>
           <w:szCs w:val="24"/>
         </w:rPr>
-        <w:t xml:space="preserve"> encerrado após cerca de 500 requisições e substituído por outro) é coerente com o reciclo periódico de processos que o Laravel Octane faz por padrão, e não ocorreu no CodeIgniter 4. A diferença entre os dois comportamentos é relevante para a memória, tratada na Seção 4.5.</w:t>
+        <w:t xml:space="preserve"> encerrado após cerca de 500 requisições e substituído por outro) é coerente com o reciclo periódico de processos que o Laravel Octane faz por padrão, e não ocorreu no CodeIgniter 4. Dhaniswara, Kusumasari e Alam (2025) também configuraram o Octane para reiniciar cada </w:t>
+      </w:r>
+      <w:r>
+        <w:rPr>
+          <w:rFonts w:ascii="Times New Roman" w:cs="Times New Roman" w:eastAsia="Times New Roman" w:hAnsi="Times New Roman"/>
+          <w:i/>
+          <w:iCs/>
+          <w:sz w:val="24"/>
+          <w:szCs w:val="24"/>
+        </w:rPr>
+        <w:t xml:space="preserve">worker</w:t>
+      </w:r>
+      <w:r>
+        <w:rPr>
+          <w:rFonts w:ascii="Times New Roman" w:cs="Times New Roman" w:eastAsia="Times New Roman" w:hAnsi="Times New Roman"/>
+          <w:sz w:val="24"/>
+          <w:szCs w:val="24"/>
+        </w:rPr>
+        <w:t xml:space="preserve"> após 500 requisições (</w:t>
+      </w:r>
+      <w:r>
+        <w:rPr>
+          <w:rFonts w:ascii="Courier New" w:cs="Courier New" w:eastAsia="Courier New" w:hAnsi="Courier New"/>
+          <w:sz w:val="22"/>
+          <w:szCs w:val="22"/>
+        </w:rPr>
+        <w:t xml:space="preserve">--max-requests=500</w:t>
+      </w:r>
+      <w:r>
+        <w:rPr>
+          <w:rFonts w:ascii="Times New Roman" w:cs="Times New Roman" w:eastAsia="Times New Roman" w:hAnsi="Times New Roman"/>
+          <w:sz w:val="24"/>
+          <w:szCs w:val="24"/>
+        </w:rPr>
+        <w:t xml:space="preserve">), equiparando-o ao reciclo de processos do PHP-FPM (</w:t>
+      </w:r>
+      <w:r>
+        <w:rPr>
+          <w:rFonts w:ascii="Courier New" w:cs="Courier New" w:eastAsia="Courier New" w:hAnsi="Courier New"/>
+          <w:sz w:val="22"/>
+          <w:szCs w:val="22"/>
+        </w:rPr>
+        <w:t xml:space="preserve">pm.max_requests</w:t>
+      </w:r>
+      <w:r>
+        <w:rPr>
+          <w:rFonts w:ascii="Times New Roman" w:cs="Times New Roman" w:eastAsia="Times New Roman" w:hAnsi="Times New Roman"/>
+          <w:sz w:val="24"/>
+          <w:szCs w:val="24"/>
+        </w:rPr>
+        <w:t xml:space="preserve">). A diferença entre os dois comportamentos é relevante para a memória, tratada na Seção 4.5.</w:t>
       </w:r>
     </w:p>
     <w:p>
@@ -6613,7 +6920,7 @@
                 <w:sz w:val="20"/>
                 <w:szCs w:val="20"/>
               </w:rPr>
-              <w:t xml:space="preserve">E – CI4 + FrankenPHP clássico (</w:t>
+              <w:t xml:space="preserve">E – CI4 + FrankenPHP clássico (2 </w:t>
             </w:r>
             <w:r>
               <w:rPr>
@@ -6635,7 +6942,7 @@
                 <w:sz w:val="20"/>
                 <w:szCs w:val="20"/>
               </w:rPr>
-              <w:t xml:space="preserve"> padrão)</w:t>
+              <w:t xml:space="preserve">, padrão)</w:t>
             </w:r>
           </w:p>
         </w:tc>
@@ -9675,7 +9982,7 @@
                 <w:sz w:val="20"/>
                 <w:szCs w:val="20"/>
               </w:rPr>
-              <w:t xml:space="preserve">E – CI4 + FrankenPHP clássico (</w:t>
+              <w:t xml:space="preserve">E – CI4 + FrankenPHP clássico (2 </w:t>
             </w:r>
             <w:r>
               <w:rPr>
@@ -9697,7 +10004,7 @@
                 <w:sz w:val="20"/>
                 <w:szCs w:val="20"/>
               </w:rPr>
-              <w:t xml:space="preserve"> padrão)</w:t>
+              <w:t xml:space="preserve">, padrão)</w:t>
             </w:r>
           </w:p>
         </w:tc>
@@ -10846,7 +11153,7 @@
                 <w:sz w:val="20"/>
                 <w:szCs w:val="20"/>
               </w:rPr>
-              <w:t xml:space="preserve">E – CI4 + FrankenPHP clássico (</w:t>
+              <w:t xml:space="preserve">E – CI4 + FrankenPHP clássico (2 </w:t>
             </w:r>
             <w:r>
               <w:rPr>
@@ -10868,7 +11175,7 @@
                 <w:sz w:val="20"/>
                 <w:szCs w:val="20"/>
               </w:rPr>
-              <w:t xml:space="preserve"> padrão)</w:t>
+              <w:t xml:space="preserve">, padrão)</w:t>
             </w:r>
           </w:p>
         </w:tc>
@@ -11367,7 +11674,43 @@
           <w:sz w:val="24"/>
           <w:szCs w:val="24"/>
         </w:rPr>
-        <w:t xml:space="preserve">Em todos os cenários a CPU ficou próxima do limite de 1,0 núcleo (92,7% a 100,6%), confirmando a saturação e que o gargalo do experimento é a CPU, e não a memória: nenhum cenário passou de 173 MiB, contra o limite de 512 MiB. Os cenários persistentes (C e D) usaram a mesma CPU que B e processaram mais requisições; ou seja, converteram o recurso em trabalho útil com mais eficiência, e não consumiram mais por requisição. O cenário A foi o único abaixo de 100%, o que pode refletir a divisão da cota entre PHP-FPM (0,85 CPU) e Nginx (0,15 CPU): como cada contêiner tem seu próprio limite, a capacidade ociosa de um não pode ser usada pelo outro. O PHP-FPM foi o mais econômico em memória (79 MiB), custo esperado de manter a aplicação carregada em memória nos demais: o CodeIgniter 4 em modo Worker usou 125 MiB (+46 MiB em relação ao A) e o Laravel Octane, 172 MiB.</w:t>
+        <w:t xml:space="preserve">Em todos os cenários a CPU ficou próxima do limite de 1,0 núcleo (92,7% a 100,6%), confirmando a saturação e que o gargalo do experimento é a CPU, e não a memória: nenhum cenário passou de 173 MiB, contra o limite de 512 MiB. Os cenários persistentes (C e D) usaram a mesma CPU que B e processaram mais requisições; ou seja, converteram o recurso em trabalho útil com mais eficiência, e não consumiram mais por requisição. O cenário A foi o único abaixo de 100%, o que pode refletir a divisão da cota entre PHP-FPM (0,85 CPU) e Nginx (0,15 CPU): como cada contêiner tem seu próprio limite, a capacidade ociosa de um não pode ser usada pelo outro. O PHP-FPM foi o mais econômico em memória (79 MiB), custo esperado de manter a aplicação carregada em memória nos demais: o CodeIgniter 4 em modo Worker usou 125 MiB (+46 MiB em relação ao A) e o Laravel Octane, 172 MiB. Esse acréscimo de memória do modo persistente também foi observado por Dhaniswara, Kusumasari e Alam (2025): em um </w:t>
+      </w:r>
+      <w:r>
+        <w:rPr>
+          <w:rFonts w:ascii="Times New Roman" w:cs="Times New Roman" w:eastAsia="Times New Roman" w:hAnsi="Times New Roman"/>
+          <w:i/>
+          <w:iCs/>
+          <w:sz w:val="24"/>
+          <w:szCs w:val="24"/>
+        </w:rPr>
+        <w:t xml:space="preserve">endpoint</w:t>
+      </w:r>
+      <w:r>
+        <w:rPr>
+          <w:rFonts w:ascii="Times New Roman" w:cs="Times New Roman" w:eastAsia="Times New Roman" w:hAnsi="Times New Roman"/>
+          <w:sz w:val="24"/>
+          <w:szCs w:val="24"/>
+        </w:rPr>
+        <w:t xml:space="preserve"> leve, o FrankenPHP com Laravel Octane usou cerca de 155 MB, contra cerca de 69 MB do PHP-FPM com Nginx, o que os autores interpretam como um </w:t>
+      </w:r>
+      <w:r>
+        <w:rPr>
+          <w:rFonts w:ascii="Times New Roman" w:cs="Times New Roman" w:eastAsia="Times New Roman" w:hAnsi="Times New Roman"/>
+          <w:i/>
+          <w:iCs/>
+          <w:sz w:val="24"/>
+          <w:szCs w:val="24"/>
+        </w:rPr>
+        <w:t xml:space="preserve">trade-off</w:t>
+      </w:r>
+      <w:r>
+        <w:rPr>
+          <w:rFonts w:ascii="Times New Roman" w:cs="Times New Roman" w:eastAsia="Times New Roman" w:hAnsi="Times New Roman"/>
+          <w:sz w:val="24"/>
+          <w:szCs w:val="24"/>
+        </w:rPr>
+        <w:t xml:space="preserve"> entre capacidade de resposta e eficiência de memória.</w:t>
       </w:r>
     </w:p>
     <w:p>
@@ -13125,7 +13468,61 @@
           <w:sz w:val="24"/>
           <w:szCs w:val="24"/>
         </w:rPr>
-        <w:t xml:space="preserve"> do servidor, elevou a vazão em 13,2% em relação ao B, o que mostra que o resultado do modo clássico depende dessa configuração: mesmo assim, E ficou 42% abaixo do cenário C em vazão. A conclusão de que o modo Worker é o que determina o ganho vale, portanto, para as duas configurações do modo clássico.</w:t>
+        <w:t xml:space="preserve"> do servidor, elevou a vazão em 13,2% em relação ao B, o que mostra que o resultado do modo clássico depende dessa configuração. Com o limite de 1,0 CPU, esse padrão equivale a 2 </w:t>
+      </w:r>
+      <w:r>
+        <w:rPr>
+          <w:rFonts w:ascii="Times New Roman" w:cs="Times New Roman" w:eastAsia="Times New Roman" w:hAnsi="Times New Roman"/>
+          <w:i/>
+          <w:iCs/>
+          <w:sz w:val="24"/>
+          <w:szCs w:val="24"/>
+        </w:rPr>
+        <w:t xml:space="preserve">threads</w:t>
+      </w:r>
+      <w:r>
+        <w:rPr>
+          <w:rFonts w:ascii="Times New Roman" w:cs="Times New Roman" w:eastAsia="Times New Roman" w:hAnsi="Times New Roman"/>
+          <w:sz w:val="24"/>
+          <w:szCs w:val="24"/>
+        </w:rPr>
+        <w:t xml:space="preserve"> PHP, menos que as 4 do B; ou seja, o cenário com menos </w:t>
+      </w:r>
+      <w:r>
+        <w:rPr>
+          <w:rFonts w:ascii="Times New Roman" w:cs="Times New Roman" w:eastAsia="Times New Roman" w:hAnsi="Times New Roman"/>
+          <w:i/>
+          <w:iCs/>
+          <w:sz w:val="24"/>
+          <w:szCs w:val="24"/>
+        </w:rPr>
+        <w:t xml:space="preserve">threads</w:t>
+      </w:r>
+      <w:r>
+        <w:rPr>
+          <w:rFonts w:ascii="Times New Roman" w:cs="Times New Roman" w:eastAsia="Times New Roman" w:hAnsi="Times New Roman"/>
+          <w:sz w:val="24"/>
+          <w:szCs w:val="24"/>
+        </w:rPr>
+        <w:t xml:space="preserve"> obteve mais vazão. Uma hipótese, não investigada neste trabalho, é que, com a cota de uma CPU já saturada, menos </w:t>
+      </w:r>
+      <w:r>
+        <w:rPr>
+          <w:rFonts w:ascii="Times New Roman" w:cs="Times New Roman" w:eastAsia="Times New Roman" w:hAnsi="Times New Roman"/>
+          <w:i/>
+          <w:iCs/>
+          <w:sz w:val="24"/>
+          <w:szCs w:val="24"/>
+        </w:rPr>
+        <w:t xml:space="preserve">threads</w:t>
+      </w:r>
+      <w:r>
+        <w:rPr>
+          <w:rFonts w:ascii="Times New Roman" w:cs="Times New Roman" w:eastAsia="Times New Roman" w:hAnsi="Times New Roman"/>
+          <w:sz w:val="24"/>
+          <w:szCs w:val="24"/>
+        </w:rPr>
+        <w:t xml:space="preserve"> concorrentes reduzam a disputa pelo processador e a troca de contexto; o experimento não separa essa explicação de outras. Mesmo assim, E ficou 42% abaixo do cenário C em vazão. A conclusão de que o modo Worker é o que determina o ganho vale, portanto, para as duas configurações do modo clássico.</w:t>
       </w:r>
     </w:p>
     <w:p>
@@ -13151,6 +13548,121 @@
           <w:szCs w:val="24"/>
         </w:rPr>
         <w:t xml:space="preserve"> O Laravel Octane (D) superou o CodeIgniter 4 em modo Worker (C) em 10,9% de vazão (336,9 contra 303,9 RPS) e 3,6% de p95, diferença menor que a que separa qualquer cenário clássico do modo Worker, mas significativa na vazão mesmo após a correção de Bonferroni (Tabela 2), e relativa a duas implementações específicas, sob uma carga e uma configuração particulares. O resultado diverge da expectativa implícita no problema de pesquisa, de que o CodeIgniter, por ser mais leve, aproveitaria melhor o modo Worker: ele ficou 9,8% abaixo do Octane, e com menos memória (125 contra 172 MiB, Tabela 4). Duas observações ajudam a interpretar: (i) o Octane é um pacote maduro, projetado para esse modelo de execução e que já trata a limpeza de estado entre requisições (OTWELL, 2024), enquanto o suporte nativo do CodeIgniter ao modo Worker é recente (CODEIGNITER FOUNDATION, 2024); e (ii) o diagnóstico mostrou que os dois preservam estado e conexão, de modo que a diferença remanescente não decorre da persistência da conexão. Não foi feito perfilamento do código, de modo que as causas permanecem hipóteses; o que os dados sustentam é a diferença de vazão, o comportamento da memória e a equivalência de estado preservado.</w:t>
+      </w:r>
+    </w:p>
+    <w:p>
+      <w:pPr>
+        <w:spacing w:after="0" w:before="0" w:line="360" w:lineRule="auto"/>
+        <w:ind w:firstLine="709"/>
+        <w:jc w:val="both"/>
+      </w:pPr>
+      <w:r>
+        <w:rPr>
+          <w:rFonts w:ascii="Times New Roman" w:cs="Times New Roman" w:eastAsia="Times New Roman" w:hAnsi="Times New Roman"/>
+          <w:b/>
+          <w:bCs/>
+          <w:sz w:val="24"/>
+          <w:szCs w:val="24"/>
+        </w:rPr>
+        <w:t xml:space="preserve">Comparação com o estudo mais próximo na literatura.</w:t>
+      </w:r>
+      <w:r>
+        <w:rPr>
+          <w:rFonts w:ascii="Times New Roman" w:cs="Times New Roman" w:eastAsia="Times New Roman" w:hAnsi="Times New Roman"/>
+          <w:sz w:val="24"/>
+          <w:szCs w:val="24"/>
+        </w:rPr>
+        <w:t xml:space="preserve"> Dhaniswara, Kusumasari e Alam (2025) compararam PHP-FPM com Nginx e FrankenPHP em modo Worker com Laravel Octane e, em um </w:t>
+      </w:r>
+      <w:r>
+        <w:rPr>
+          <w:rFonts w:ascii="Times New Roman" w:cs="Times New Roman" w:eastAsia="Times New Roman" w:hAnsi="Times New Roman"/>
+          <w:i/>
+          <w:iCs/>
+          <w:sz w:val="24"/>
+          <w:szCs w:val="24"/>
+        </w:rPr>
+        <w:t xml:space="preserve">endpoint</w:t>
+      </w:r>
+      <w:r>
+        <w:rPr>
+          <w:rFonts w:ascii="Times New Roman" w:cs="Times New Roman" w:eastAsia="Times New Roman" w:hAnsi="Times New Roman"/>
+          <w:sz w:val="24"/>
+          <w:szCs w:val="24"/>
+        </w:rPr>
+        <w:t xml:space="preserve"> de carga leve, observaram vantagem do FrankenPHP em tempo de resposta médio (−15,8%), vazão (+18,6%) e latência de cauda (p99 de 574 contra 794 ms), com maior uso de memória (cerca de 155 contra 69 MB). Há concordância na direção dos resultados: o modo Worker melhorou a vazão e a latência, inclusive na cauda, ao custo de mais memória, e em ambos os estudos a CPU foi o recurso saturado. A magnitude, porém, difere: aqui o CodeIgniter 4 em modo Worker teve vazão 112,2% maior que a do PHP-FPM e p99 49,4% menor, ganhos bem superiores aos relatados por eles. Não é possível atribuir a diferença a uma única causa, pois os estudos diferem em </w:t>
+      </w:r>
+      <w:r>
+        <w:rPr>
+          <w:rFonts w:ascii="Times New Roman" w:cs="Times New Roman" w:eastAsia="Times New Roman" w:hAnsi="Times New Roman"/>
+          <w:i/>
+          <w:iCs/>
+          <w:sz w:val="24"/>
+          <w:szCs w:val="24"/>
+        </w:rPr>
+        <w:t xml:space="preserve">framework</w:t>
+      </w:r>
+      <w:r>
+        <w:rPr>
+          <w:rFonts w:ascii="Times New Roman" w:cs="Times New Roman" w:eastAsia="Times New Roman" w:hAnsi="Times New Roman"/>
+          <w:sz w:val="24"/>
+          <w:szCs w:val="24"/>
+        </w:rPr>
+        <w:t xml:space="preserve"> (Laravel contra CodeIgniter 4), </w:t>
+      </w:r>
+      <w:r>
+        <w:rPr>
+          <w:rFonts w:ascii="Times New Roman" w:cs="Times New Roman" w:eastAsia="Times New Roman" w:hAnsi="Times New Roman"/>
+          <w:i/>
+          <w:iCs/>
+          <w:sz w:val="24"/>
+          <w:szCs w:val="24"/>
+        </w:rPr>
+        <w:t xml:space="preserve">endpoints</w:t>
+      </w:r>
+      <w:r>
+        <w:rPr>
+          <w:rFonts w:ascii="Times New Roman" w:cs="Times New Roman" w:eastAsia="Times New Roman" w:hAnsi="Times New Roman"/>
+          <w:sz w:val="24"/>
+          <w:szCs w:val="24"/>
+        </w:rPr>
+        <w:t xml:space="preserve">, banco de dados (MySQL contra PostgreSQL), ferramenta de carga (JMeter contra k6), versão do PHP (8.2 contra 8.3), recursos (4 núcleos contra 1,0 CPU) e arquitetura comparada (eles confrontam o modo Worker diretamente com o PHP-FPM, sem o modo clássico do FrankenPHP como cenário intermediário, que aqui trouxe ganho pequeno). A comparação deve ser lida, portanto, como convergência qualitativa, e não como replicação. Os autores observaram ainda que, em um </w:t>
+      </w:r>
+      <w:r>
+        <w:rPr>
+          <w:rFonts w:ascii="Times New Roman" w:cs="Times New Roman" w:eastAsia="Times New Roman" w:hAnsi="Times New Roman"/>
+          <w:i/>
+          <w:iCs/>
+          <w:sz w:val="24"/>
+          <w:szCs w:val="24"/>
+        </w:rPr>
+        <w:t xml:space="preserve">endpoint</w:t>
+      </w:r>
+      <w:r>
+        <w:rPr>
+          <w:rFonts w:ascii="Times New Roman" w:cs="Times New Roman" w:eastAsia="Times New Roman" w:hAnsi="Times New Roman"/>
+          <w:sz w:val="24"/>
+          <w:szCs w:val="24"/>
+        </w:rPr>
+        <w:t xml:space="preserve"> que serializa grande volume de dados, as duas arquiteturas saturaram a CPU com desempenho semelhante, com gargalo na aplicação; os </w:t>
+      </w:r>
+      <w:r>
+        <w:rPr>
+          <w:rFonts w:ascii="Times New Roman" w:cs="Times New Roman" w:eastAsia="Times New Roman" w:hAnsi="Times New Roman"/>
+          <w:i/>
+          <w:iCs/>
+          <w:sz w:val="24"/>
+          <w:szCs w:val="24"/>
+        </w:rPr>
+        <w:t xml:space="preserve">endpoints</w:t>
+      </w:r>
+      <w:r>
+        <w:rPr>
+          <w:rFonts w:ascii="Times New Roman" w:cs="Times New Roman" w:eastAsia="Times New Roman" w:hAnsi="Times New Roman"/>
+          <w:sz w:val="24"/>
+          <w:szCs w:val="24"/>
+        </w:rPr>
+        <w:t xml:space="preserve"> deste estudo são simples e não exercitam essa condição (Seção 4.8).</w:t>
       </w:r>
     </w:p>
     <w:p>
@@ -13308,7 +13820,25 @@
           <w:sz w:val="24"/>
           <w:szCs w:val="24"/>
         </w:rPr>
-        <w:t xml:space="preserve"> os endpoints são simples e a carga é de usuários virtuais sem tempo de espera, o que satura o servidor e torna a latência função da vazão (Seção 4.3). Os resultados não se estendem automaticamente a aplicações reais, com consultas mais complexas e uso de sessão;</w:t>
+        <w:t xml:space="preserve"> os endpoints são simples e a carga é de usuários virtuais sem tempo de espera, o que satura o servidor e torna a latência função da vazão (Seção 4.3). Os resultados não se estendem automaticamente a aplicações reais, com consultas mais complexas e uso de sessão; em um </w:t>
+      </w:r>
+      <w:r>
+        <w:rPr>
+          <w:rFonts w:ascii="Times New Roman" w:cs="Times New Roman" w:eastAsia="Times New Roman" w:hAnsi="Times New Roman"/>
+          <w:i/>
+          <w:iCs/>
+          <w:sz w:val="24"/>
+          <w:szCs w:val="24"/>
+        </w:rPr>
+        <w:t xml:space="preserve">endpoint</w:t>
+      </w:r>
+      <w:r>
+        <w:rPr>
+          <w:rFonts w:ascii="Times New Roman" w:cs="Times New Roman" w:eastAsia="Times New Roman" w:hAnsi="Times New Roman"/>
+          <w:sz w:val="24"/>
+          <w:szCs w:val="24"/>
+        </w:rPr>
+        <w:t xml:space="preserve"> que serializa grande volume de dados, Dhaniswara, Kusumasari e Alam (2025) observaram que o modo Worker e o PHP-FPM tiveram desempenho semelhante, com o gargalo na aplicação e não no servidor, o que indica que o ganho depende da carga;</w:t>
       </w:r>
     </w:p>
     <w:p>
@@ -13662,7 +14192,7 @@
           <w:sz w:val="24"/>
           <w:szCs w:val="24"/>
         </w:rPr>
-        <w:t xml:space="preserve">), muito inferior ao do modo Worker. O Laravel Octane obteve a maior vazão (336,9 RPS), 10,9% acima do CodeIgniter 4 em modo Worker, diferença pequena que, ainda assim, resistiu à correção de Bonferroni (p ajustado = 0,001), mas é relativa a duas implementações específicas.</w:t>
+        <w:t xml:space="preserve">, que nas condições do experimento são 2), muito inferior ao do modo Worker. O Laravel Octane obteve a maior vazão (336,9 RPS), 10,9% acima do CodeIgniter 4 em modo Worker, diferença pequena que, ainda assim, resistiu à correção de Bonferroni (p ajustado = 0,001), mas é relativa a duas implementações específicas.</w:t>
       </w:r>
     </w:p>
     <w:p>
@@ -13862,7 +14392,7 @@
           <w:sz w:val="24"/>
           <w:szCs w:val="24"/>
         </w:rPr>
-        <w:t xml:space="preserve">. Para equipes que mantêm aplicações em CodeIgniter 4, os resultados indicam que vale avaliar o modo Worker.</w:t>
+        <w:t xml:space="preserve">. Os resultados concordam, na direção, com o estudo de Dhaniswara, Kusumasari e Alam (2025) com Laravel, em que o FrankenPHP em modo Worker também melhorou vazão e latência ao custo de mais memória, embora com magnitude diferente. Para equipes que mantêm aplicações em CodeIgniter 4, os resultados indicam que vale avaliar o modo Worker.</w:t>
       </w:r>
     </w:p>
     <w:p>
@@ -13928,7 +14458,25 @@
           <w:sz w:val="24"/>
           <w:szCs w:val="24"/>
         </w:rPr>
-        <w:t xml:space="preserve"> e do reaproveitamento da conexão; ampliar o número de execuções por cenário; realizar testes de duração de várias horas e com aplicações mais realistas, com consultas, sessões e outros serviços, para investigar o vazamento de estado; perfilar o código para explicar a diferença entre o CodeIgniter 4 em Worker e o Laravel Octane e entre o PHP-FPM e o FrankenPHP clássico; e comparar outras alternativas persistentes, como Swoole e RoadRunner.</w:t>
+        <w:t xml:space="preserve"> e do reaproveitamento da conexão; ampliar o número de execuções por cenário; realizar testes de duração de várias horas e com aplicações mais realistas, com consultas, sessões e outros serviços, para investigar o vazamento de estado; perfilar o código para explicar a diferença entre o CodeIgniter 4 em Worker e o Laravel Octane e entre o PHP-FPM e o FrankenPHP clássico; testar </w:t>
+      </w:r>
+      <w:r>
+        <w:rPr>
+          <w:rFonts w:ascii="Times New Roman" w:cs="Times New Roman" w:eastAsia="Times New Roman" w:hAnsi="Times New Roman"/>
+          <w:i/>
+          <w:iCs/>
+          <w:sz w:val="24"/>
+          <w:szCs w:val="24"/>
+        </w:rPr>
+        <w:t xml:space="preserve">endpoints</w:t>
+      </w:r>
+      <w:r>
+        <w:rPr>
+          <w:rFonts w:ascii="Times New Roman" w:cs="Times New Roman" w:eastAsia="Times New Roman" w:hAnsi="Times New Roman"/>
+          <w:sz w:val="24"/>
+          <w:szCs w:val="24"/>
+        </w:rPr>
+        <w:t xml:space="preserve"> com grande volume de dados, que no estudo de Dhaniswara, Kusumasari e Alam (2025) levaram as duas arquiteturas ao limite de CPU, para verificar até que ponto o ganho do modo Worker depende da carga; e comparar outras alternativas persistentes, como Swoole e RoadRunner.</w:t>
       </w:r>
     </w:p>
     <w:p>
@@ -14041,6 +14589,38 @@
           <w:szCs w:val="24"/>
         </w:rPr>
         <w:t xml:space="preserve">. 2024. Disponível em: https://codeigniter.com/user_guide/. Acesso em: 19 out. 2026.</w:t>
+      </w:r>
+    </w:p>
+    <w:p>
+      <w:pPr>
+        <w:spacing w:after="240" w:line="240"/>
+        <w:jc w:val="left"/>
+      </w:pPr>
+      <w:r>
+        <w:rPr>
+          <w:rFonts w:ascii="Times New Roman" w:cs="Times New Roman" w:eastAsia="Times New Roman" w:hAnsi="Times New Roman"/>
+          <w:sz w:val="24"/>
+          <w:szCs w:val="24"/>
+        </w:rPr>
+        <w:t xml:space="preserve">DHANISWARA, Abiyoga; KUSUMASARI, Tien Fabrianti; ALAM, Ekky Novriza. Performance Evaluation of Laravel Application Deployment on Docker. In: INTERNATIONAL CONFERENCE ON INFORMATION TECHNOLOGY AND COMPUTING (ICITCOM), 2025, [S. l.]. </w:t>
+      </w:r>
+      <w:r>
+        <w:rPr>
+          <w:rFonts w:ascii="Times New Roman" w:cs="Times New Roman" w:eastAsia="Times New Roman" w:hAnsi="Times New Roman"/>
+          <w:b/>
+          <w:bCs/>
+          <w:sz w:val="24"/>
+          <w:szCs w:val="24"/>
+        </w:rPr>
+        <w:t xml:space="preserve">Proceedings</w:t>
+      </w:r>
+      <w:r>
+        <w:rPr>
+          <w:rFonts w:ascii="Times New Roman" w:cs="Times New Roman" w:eastAsia="Times New Roman" w:hAnsi="Times New Roman"/>
+          <w:sz w:val="24"/>
+          <w:szCs w:val="24"/>
+        </w:rPr>
+        <w:t xml:space="preserve"> [...]. [S. l.]: IEEE, 2025. p. 170-175. DOI: https://doi.org/10.1109/ICITCOM66635.2025.11265204.</w:t>
       </w:r>
     </w:p>
     <w:p>
@@ -21415,22 +21995,22 @@
           <w:sz w:val="16"/>
           <w:szCs w:val="16"/>
         </w:rPr>
-        <w:t xml:space="preserve">    # FrankenPHP modo Classic — configuração PADRÃO de threads (sensibilidade; ~2x</w:t>
-      </w:r>
-    </w:p>
-    <w:p>
-      <w:pPr>
-        <w:spacing w:line="240"/>
-        <w:ind w:firstLine="0"/>
-        <w:jc w:val="left"/>
-      </w:pPr>
-      <w:r>
-        <w:rPr>
-          <w:rFonts w:ascii="Courier New" w:cs="Courier New" w:eastAsia="Courier New" w:hAnsi="Courier New"/>
-          <w:sz w:val="16"/>
-          <w:szCs w:val="16"/>
-        </w:rPr>
-        <w:t xml:space="preserve">        núcleos do hospedeiro)</w:t>
+        <w:t xml:space="preserve">    # FrankenPHP modo Classic — configuração PADRÃO de threads (sensibilidade; 2x os</w:t>
+      </w:r>
+    </w:p>
+    <w:p>
+      <w:pPr>
+        <w:spacing w:line="240"/>
+        <w:ind w:firstLine="0"/>
+        <w:jc w:val="left"/>
+      </w:pPr>
+      <w:r>
+        <w:rPr>
+          <w:rFonts w:ascii="Courier New" w:cs="Courier New" w:eastAsia="Courier New" w:hAnsi="Courier New"/>
+          <w:sz w:val="16"/>
+          <w:szCs w:val="16"/>
+        </w:rPr>
+        <w:t xml:space="preserve">        núcleos de CPU visíveis: 2 threads com o limite de 1,0 CPU)</w:t>
       </w:r>
     </w:p>
     <w:p>

</xml_diff>